<commit_message>
Lab 1: add 'Checked by' to the report
</commit_message>
<xml_diff>
--- a/lab1/report/Report_Lab1.docx
+++ b/lab1/report/Report_Lab1.docx
@@ -540,15 +540,26 @@
     </w:p>
     <w:p>
       <w:pPr>
-        <w:jc w:val="center"/>
+        <w:jc w:val="right"/>
+      </w:pPr>
+      <w:r>
         <w:rPr>
           <w:b/>
           <w:bCs/>
           <w:sz w:val="28"/>
           <w:szCs w:val="28"/>
-          <w:lang w:val="en-GB" w:bidi="th-TH"/>
-        </w:rPr>
-      </w:pPr>
+          <w:lang w:val="en-GB"/>
+        </w:rPr>
+        <w:t xml:space="preserve">Checked by: </w:t>
+      </w:r>
+      <w:r>
+        <w:rPr>
+          <w:sz w:val="28"/>
+          <w:szCs w:val="28"/>
+          <w:lang w:val="en-GB"/>
+        </w:rPr>
+        <w:t>asist. univ. Istrati Daniel</w:t>
+      </w:r>
     </w:p>
     <w:p>
       <w:pPr>

</xml_diff>

<commit_message>
Lab 1: make ReservationNumberGenerator the Singleton; BookingSystem is now injected
</commit_message>
<xml_diff>
--- a/lab1/report/Report_Lab1.docx
+++ b/lab1/report/Report_Lab1.docx
@@ -1803,7 +1803,7 @@
         <w:rPr>
           <w:lang w:val="en-GB"/>
         </w:rPr>
-        <w:t xml:space="preserve"> Shared resources that must exist exactly once: configuration, logging, caches, a connection manager, a registry.</w:t>
+        <w:t xml:space="preserve"> Objects that must exist exactly once because a second instance would break something: an ID or sequence generator, the application configuration, a logger.</w:t>
       </w:r>
     </w:p>
     <w:p>
@@ -1837,13 +1837,47 @@
           <w:bCs/>
           <w:lang w:val="en-GB"/>
         </w:rPr>
+        <w:t xml:space="preserve">What should not be a Singleton.</w:t>
+      </w:r>
+      <w:r>
+        <w:rPr>
+          <w:lang w:val="en-GB"/>
+        </w:rPr>
+        <w:t xml:space="preserve"> A database, a repository or a service that stores application data should </w:t>
+      </w:r>
+      <w:r>
+        <w:rPr>
+          <w:b/>
+          <w:bCs/>
+          <w:lang w:val="en-GB"/>
+        </w:rPr>
+        <w:t xml:space="preserve">not</w:t>
+      </w:r>
+      <w:r>
+        <w:rPr>
+          <w:lang w:val="en-GB"/>
+        </w:rPr>
+        <w:t xml:space="preserve"> be a Singleton, even if the program uses only one of them. Tests need a fresh, empty instance (or a fake one) for every test case, a real application may need several databases or connections, and a globally accessible data store hides which classes depend on it. Such objects should be created once by the client and passed to the classes that need them (dependency injection, as in the Dependency Inversion Principle). The Singleton fits objects whose uniqueness is part of their meaning, where a second instance would cause wrong behaviour: an ID or sequence generator, the application configuration, a logger.</w:t>
+      </w:r>
+    </w:p>
+    <w:p>
+      <w:pPr>
+        <w:pStyle w:val="NoSpacing"/>
+        <w:spacing w:after="120"/>
+      </w:pPr>
+      <w:r>
+        <w:rPr>
+          <w:b/>
+          <w:bCs/>
+          <w:lang w:val="en-GB"/>
+        </w:rPr>
         <w:t xml:space="preserve">In the hotel domain.</w:t>
       </w:r>
       <w:r>
         <w:rPr>
           <w:lang w:val="en-GB"/>
         </w:rPr>
-        <w:t xml:space="preserve"> The hotel has one booking system. If every reception desk had its own copy, two desks could sell the same room for the same night.</w:t>
+        <w:t xml:space="preserve"> Confirmation codes (RES-0001, RES-0002, ...) must be unique in the whole hotel. If two generators existed, both would start counting from 1 and two guests would receive the same code, so the generator must exist exactly once.</w:t>
       </w:r>
     </w:p>
     <w:p>
@@ -3214,13 +3248,13 @@
           <w:shd w:val="clear" w:color="auto" w:fill="F2F2F2"/>
           <w:lang w:val="en-GB"/>
         </w:rPr>
-        <w:t xml:space="preserve">BookingSystem</w:t>
-      </w:r>
-      <w:r>
-        <w:rPr>
-          <w:lang w:val="en-GB"/>
-        </w:rPr>
-        <w:t xml:space="preserve">, the single shared registry of rooms and reservations;</w:t>
+        <w:t xml:space="preserve">ReservationNumberGenerator</w:t>
+      </w:r>
+      <w:r>
+        <w:rPr>
+          <w:lang w:val="en-GB"/>
+        </w:rPr>
+        <w:t xml:space="preserve">, which hands out unique confirmation codes;</w:t>
       </w:r>
     </w:p>
     <w:p>
@@ -3417,7 +3451,7 @@
         <w:rPr>
           <w:lang w:val="en-GB"/>
         </w:rPr>
-        <w:t xml:space="preserve">The project models a small hotel. Rooms of different types are opened through factories, all rooms and reservations are stored in one booking system, and reservations with optional extras are created with a builder. The packages are separated by responsibility, as required: </w:t>
+        <w:t xml:space="preserve">The project models a small hotel. Rooms of different types are opened through factories, reservations with optional extras are created with a builder, and every confirmed reservation receives a unique code from a single number generator. Rooms and reservations are stored in a </w:t>
       </w:r>
       <w:r>
         <w:rPr>
@@ -3427,13 +3461,13 @@
           <w:shd w:val="clear" w:color="auto" w:fill="F2F2F2"/>
           <w:lang w:val="en-GB"/>
         </w:rPr>
-        <w:t xml:space="preserve">client</w:t>
-      </w:r>
-      <w:r>
-        <w:rPr>
-          <w:lang w:val="en-GB"/>
-        </w:rPr>
-        <w:t xml:space="preserve"> contains the program that uses the domain, and </w:t>
+        <w:t xml:space="preserve">BookingSystem</w:t>
+      </w:r>
+      <w:r>
+        <w:rPr>
+          <w:lang w:val="en-GB"/>
+        </w:rPr>
+        <w:t xml:space="preserve">, which is a regular class: the client creates it once and passes it to the parts that need it. The packages are separated by responsibility, as required: </w:t>
       </w:r>
       <w:r>
         <w:rPr>
@@ -3443,13 +3477,29 @@
           <w:shd w:val="clear" w:color="auto" w:fill="F2F2F2"/>
           <w:lang w:val="en-GB"/>
         </w:rPr>
+        <w:t xml:space="preserve">client</w:t>
+      </w:r>
+      <w:r>
+        <w:rPr>
+          <w:lang w:val="en-GB"/>
+        </w:rPr>
+        <w:t xml:space="preserve"> contains the program that uses the domain, and </w:t>
+      </w:r>
+      <w:r>
+        <w:rPr>
+          <w:rFonts w:ascii="Consolas" w:hAnsi="Consolas" w:cs="Courier New"/>
+          <w:sz w:val="22"/>
+          <w:szCs w:val="22"/>
+          <w:shd w:val="clear" w:color="auto" w:fill="F2F2F2"/>
+          <w:lang w:val="en-GB"/>
+        </w:rPr>
         <w:t xml:space="preserve">domain</w:t>
       </w:r>
       <w:r>
         <w:rPr>
           <w:lang w:val="en-GB"/>
         </w:rPr>
-        <w:t xml:space="preserve"> contains the models, the factories, the builder director and the booking service.</w:t>
+        <w:t xml:space="preserve"> contains the models, the factories, the builder director and the services.</w:t>
       </w:r>
     </w:p>
     <w:p>
@@ -3929,6 +3979,31 @@
     </w:p>
     <w:p>
       <w:pPr>
+        <w:keepNext/>
+        <w:keepLines/>
+        <w:pBdr>
+          <w:top w:val="single" w:sz="4" w:space="4" w:color="BFBFBF"/>
+          <w:left w:val="single" w:sz="4" w:space="4" w:color="BFBFBF"/>
+          <w:bottom w:val="single" w:sz="4" w:space="4" w:color="BFBFBF"/>
+          <w:right w:val="single" w:sz="4" w:space="4" w:color="BFBFBF"/>
+        </w:pBdr>
+        <w:shd w:val="clear" w:color="auto" w:fill="F5F5F5"/>
+        <w:spacing w:before="0" w:after="0" w:line="240" w:lineRule="auto"/>
+        <w:ind w:left="113" w:right="113"/>
+        <w:jc w:val="left"/>
+      </w:pPr>
+      <w:r>
+        <w:rPr>
+          <w:rFonts w:ascii="Consolas" w:hAnsi="Consolas" w:cs="Courier New"/>
+          <w:sz w:val="18"/>
+          <w:szCs w:val="18"/>
+          <w:lang w:val="en-GB"/>
+        </w:rPr>
+        <w:t xml:space="preserve">        ├── ReservationNumberGenerator.java  Singleton</w:t>
+      </w:r>
+    </w:p>
+    <w:p>
+      <w:pPr>
         <w:keepLines/>
         <w:pBdr>
           <w:top w:val="single" w:sz="4" w:space="4" w:color="BFBFBF"/>
@@ -3948,7 +4023,7 @@
           <w:szCs w:val="18"/>
           <w:lang w:val="en-GB"/>
         </w:rPr>
-        <w:t xml:space="preserve">        └── BookingSystem.java     Singleton</w:t>
+        <w:t xml:space="preserve">        └── BookingSystem.java     rooms + reservations (injected, not a Singleton)</w:t>
       </w:r>
     </w:p>
     <w:p>
@@ -3968,7 +4043,7 @@
           <w:szCs w:val="24"/>
           <w:lang w:val="en-GB"/>
         </w:rPr>
-        <w:t xml:space="preserve">4.2 Singleton — BookingSystem</w:t>
+        <w:t xml:space="preserve">4.2 Singleton — ReservationNumberGenerator</w:t>
       </w:r>
     </w:p>
     <w:p>
@@ -3977,6 +4052,12 @@
         <w:keepNext/>
         <w:spacing w:after="120"/>
       </w:pPr>
+      <w:r>
+        <w:rPr>
+          <w:lang w:val="en-GB"/>
+        </w:rPr>
+        <w:t xml:space="preserve">Every confirmed reservation gets a confirmation code such as </w:t>
+      </w:r>
       <w:r>
         <w:rPr>
           <w:rFonts w:ascii="Consolas" w:hAnsi="Consolas" w:cs="Courier New"/>
@@ -3985,13 +4066,13 @@
           <w:shd w:val="clear" w:color="auto" w:fill="F2F2F2"/>
           <w:lang w:val="en-GB"/>
         </w:rPr>
-        <w:t xml:space="preserve">BookingSystem</w:t>
-      </w:r>
-      <w:r>
-        <w:rPr>
-          <w:lang w:val="en-GB"/>
-        </w:rPr>
-        <w:t xml:space="preserve"> stores every room and reservation of the hotel. Its constructor is private, and the only way to get the object is </w:t>
+        <w:t xml:space="preserve">RES-0001</w:t>
+      </w:r>
+      <w:r>
+        <w:rPr>
+          <w:lang w:val="en-GB"/>
+        </w:rPr>
+        <w:t xml:space="preserve">. The codes must be unique in the whole hotel, so there must be exactly one generator. Its constructor is private, and the only way to get the object is </w:t>
       </w:r>
       <w:r>
         <w:rPr>
@@ -4037,619 +4118,7 @@
         <w:rPr>
           <w:lang w:val="en-GB"/>
         </w:rPr>
-        <w:t xml:space="preserve"> field. That makes the creation thread-safe while avoiding a lock on every call after the instance exists.</w:t>
-      </w:r>
-    </w:p>
-    <w:p>
-      <w:pPr>
-        <w:keepNext/>
-        <w:keepLines/>
-        <w:pBdr>
-          <w:top w:val="single" w:sz="4" w:space="4" w:color="BFBFBF"/>
-          <w:left w:val="single" w:sz="4" w:space="4" w:color="BFBFBF"/>
-          <w:bottom w:val="single" w:sz="4" w:space="4" w:color="BFBFBF"/>
-          <w:right w:val="single" w:sz="4" w:space="4" w:color="BFBFBF"/>
-        </w:pBdr>
-        <w:shd w:val="clear" w:color="auto" w:fill="F5F5F5"/>
-        <w:spacing w:before="120" w:after="0" w:line="240" w:lineRule="auto"/>
-        <w:ind w:left="113" w:right="113"/>
-        <w:jc w:val="left"/>
-      </w:pPr>
-      <w:r>
-        <w:rPr>
-          <w:rFonts w:ascii="Consolas" w:hAnsi="Consolas" w:cs="Courier New"/>
-          <w:sz w:val="18"/>
-          <w:szCs w:val="18"/>
-          <w:lang w:val="en-GB"/>
-        </w:rPr>
-        <w:t xml:space="preserve">public final class BookingSystem {</w:t>
-      </w:r>
-    </w:p>
-    <w:p>
-      <w:pPr>
-        <w:keepNext/>
-        <w:keepLines/>
-        <w:pBdr>
-          <w:top w:val="single" w:sz="4" w:space="4" w:color="BFBFBF"/>
-          <w:left w:val="single" w:sz="4" w:space="4" w:color="BFBFBF"/>
-          <w:bottom w:val="single" w:sz="4" w:space="4" w:color="BFBFBF"/>
-          <w:right w:val="single" w:sz="4" w:space="4" w:color="BFBFBF"/>
-        </w:pBdr>
-        <w:shd w:val="clear" w:color="auto" w:fill="F5F5F5"/>
-        <w:spacing w:before="0" w:after="0" w:line="240" w:lineRule="auto"/>
-        <w:ind w:left="113" w:right="113"/>
-        <w:jc w:val="left"/>
-      </w:pPr>
-      <w:r>
-        <w:rPr>
-          <w:rFonts w:ascii="Consolas" w:hAnsi="Consolas" w:cs="Courier New"/>
-          <w:sz w:val="18"/>
-          <w:szCs w:val="18"/>
-          <w:lang w:val="en-GB"/>
-        </w:rPr>
-        <w:t xml:space="preserve"> </w:t>
-      </w:r>
-    </w:p>
-    <w:p>
-      <w:pPr>
-        <w:keepNext/>
-        <w:keepLines/>
-        <w:pBdr>
-          <w:top w:val="single" w:sz="4" w:space="4" w:color="BFBFBF"/>
-          <w:left w:val="single" w:sz="4" w:space="4" w:color="BFBFBF"/>
-          <w:bottom w:val="single" w:sz="4" w:space="4" w:color="BFBFBF"/>
-          <w:right w:val="single" w:sz="4" w:space="4" w:color="BFBFBF"/>
-        </w:pBdr>
-        <w:shd w:val="clear" w:color="auto" w:fill="F5F5F5"/>
-        <w:spacing w:before="0" w:after="0" w:line="240" w:lineRule="auto"/>
-        <w:ind w:left="113" w:right="113"/>
-        <w:jc w:val="left"/>
-      </w:pPr>
-      <w:r>
-        <w:rPr>
-          <w:rFonts w:ascii="Consolas" w:hAnsi="Consolas" w:cs="Courier New"/>
-          <w:sz w:val="18"/>
-          <w:szCs w:val="18"/>
-          <w:lang w:val="en-GB"/>
-        </w:rPr>
-        <w:t xml:space="preserve">    // volatile: every thread sees the fully constructed instance</w:t>
-      </w:r>
-    </w:p>
-    <w:p>
-      <w:pPr>
-        <w:keepNext/>
-        <w:keepLines/>
-        <w:pBdr>
-          <w:top w:val="single" w:sz="4" w:space="4" w:color="BFBFBF"/>
-          <w:left w:val="single" w:sz="4" w:space="4" w:color="BFBFBF"/>
-          <w:bottom w:val="single" w:sz="4" w:space="4" w:color="BFBFBF"/>
-          <w:right w:val="single" w:sz="4" w:space="4" w:color="BFBFBF"/>
-        </w:pBdr>
-        <w:shd w:val="clear" w:color="auto" w:fill="F5F5F5"/>
-        <w:spacing w:before="0" w:after="0" w:line="240" w:lineRule="auto"/>
-        <w:ind w:left="113" w:right="113"/>
-        <w:jc w:val="left"/>
-      </w:pPr>
-      <w:r>
-        <w:rPr>
-          <w:rFonts w:ascii="Consolas" w:hAnsi="Consolas" w:cs="Courier New"/>
-          <w:sz w:val="18"/>
-          <w:szCs w:val="18"/>
-          <w:lang w:val="en-GB"/>
-        </w:rPr>
-        <w:t xml:space="preserve">    private static volatile BookingSystem instance;</w:t>
-      </w:r>
-    </w:p>
-    <w:p>
-      <w:pPr>
-        <w:keepNext/>
-        <w:keepLines/>
-        <w:pBdr>
-          <w:top w:val="single" w:sz="4" w:space="4" w:color="BFBFBF"/>
-          <w:left w:val="single" w:sz="4" w:space="4" w:color="BFBFBF"/>
-          <w:bottom w:val="single" w:sz="4" w:space="4" w:color="BFBFBF"/>
-          <w:right w:val="single" w:sz="4" w:space="4" w:color="BFBFBF"/>
-        </w:pBdr>
-        <w:shd w:val="clear" w:color="auto" w:fill="F5F5F5"/>
-        <w:spacing w:before="0" w:after="0" w:line="240" w:lineRule="auto"/>
-        <w:ind w:left="113" w:right="113"/>
-        <w:jc w:val="left"/>
-      </w:pPr>
-      <w:r>
-        <w:rPr>
-          <w:rFonts w:ascii="Consolas" w:hAnsi="Consolas" w:cs="Courier New"/>
-          <w:sz w:val="18"/>
-          <w:szCs w:val="18"/>
-          <w:lang w:val="en-GB"/>
-        </w:rPr>
-        <w:t xml:space="preserve"> </w:t>
-      </w:r>
-    </w:p>
-    <w:p>
-      <w:pPr>
-        <w:keepNext/>
-        <w:keepLines/>
-        <w:pBdr>
-          <w:top w:val="single" w:sz="4" w:space="4" w:color="BFBFBF"/>
-          <w:left w:val="single" w:sz="4" w:space="4" w:color="BFBFBF"/>
-          <w:bottom w:val="single" w:sz="4" w:space="4" w:color="BFBFBF"/>
-          <w:right w:val="single" w:sz="4" w:space="4" w:color="BFBFBF"/>
-        </w:pBdr>
-        <w:shd w:val="clear" w:color="auto" w:fill="F5F5F5"/>
-        <w:spacing w:before="0" w:after="0" w:line="240" w:lineRule="auto"/>
-        <w:ind w:left="113" w:right="113"/>
-        <w:jc w:val="left"/>
-      </w:pPr>
-      <w:r>
-        <w:rPr>
-          <w:rFonts w:ascii="Consolas" w:hAnsi="Consolas" w:cs="Courier New"/>
-          <w:sz w:val="18"/>
-          <w:szCs w:val="18"/>
-          <w:lang w:val="en-GB"/>
-        </w:rPr>
-        <w:t xml:space="preserve">    private final Map&lt;Integer, Room&gt; rooms = new LinkedHashMap&lt;&gt;();</w:t>
-      </w:r>
-    </w:p>
-    <w:p>
-      <w:pPr>
-        <w:keepNext/>
-        <w:keepLines/>
-        <w:pBdr>
-          <w:top w:val="single" w:sz="4" w:space="4" w:color="BFBFBF"/>
-          <w:left w:val="single" w:sz="4" w:space="4" w:color="BFBFBF"/>
-          <w:bottom w:val="single" w:sz="4" w:space="4" w:color="BFBFBF"/>
-          <w:right w:val="single" w:sz="4" w:space="4" w:color="BFBFBF"/>
-        </w:pBdr>
-        <w:shd w:val="clear" w:color="auto" w:fill="F5F5F5"/>
-        <w:spacing w:before="0" w:after="0" w:line="240" w:lineRule="auto"/>
-        <w:ind w:left="113" w:right="113"/>
-        <w:jc w:val="left"/>
-      </w:pPr>
-      <w:r>
-        <w:rPr>
-          <w:rFonts w:ascii="Consolas" w:hAnsi="Consolas" w:cs="Courier New"/>
-          <w:sz w:val="18"/>
-          <w:szCs w:val="18"/>
-          <w:lang w:val="en-GB"/>
-        </w:rPr>
-        <w:t xml:space="preserve">    private final List&lt;Reservation&gt; reservations = new ArrayList&lt;&gt;();</w:t>
-      </w:r>
-    </w:p>
-    <w:p>
-      <w:pPr>
-        <w:keepNext/>
-        <w:keepLines/>
-        <w:pBdr>
-          <w:top w:val="single" w:sz="4" w:space="4" w:color="BFBFBF"/>
-          <w:left w:val="single" w:sz="4" w:space="4" w:color="BFBFBF"/>
-          <w:bottom w:val="single" w:sz="4" w:space="4" w:color="BFBFBF"/>
-          <w:right w:val="single" w:sz="4" w:space="4" w:color="BFBFBF"/>
-        </w:pBdr>
-        <w:shd w:val="clear" w:color="auto" w:fill="F5F5F5"/>
-        <w:spacing w:before="0" w:after="0" w:line="240" w:lineRule="auto"/>
-        <w:ind w:left="113" w:right="113"/>
-        <w:jc w:val="left"/>
-      </w:pPr>
-      <w:r>
-        <w:rPr>
-          <w:rFonts w:ascii="Consolas" w:hAnsi="Consolas" w:cs="Courier New"/>
-          <w:sz w:val="18"/>
-          <w:szCs w:val="18"/>
-          <w:lang w:val="en-GB"/>
-        </w:rPr>
-        <w:t xml:space="preserve"> </w:t>
-      </w:r>
-    </w:p>
-    <w:p>
-      <w:pPr>
-        <w:keepNext/>
-        <w:keepLines/>
-        <w:pBdr>
-          <w:top w:val="single" w:sz="4" w:space="4" w:color="BFBFBF"/>
-          <w:left w:val="single" w:sz="4" w:space="4" w:color="BFBFBF"/>
-          <w:bottom w:val="single" w:sz="4" w:space="4" w:color="BFBFBF"/>
-          <w:right w:val="single" w:sz="4" w:space="4" w:color="BFBFBF"/>
-        </w:pBdr>
-        <w:shd w:val="clear" w:color="auto" w:fill="F5F5F5"/>
-        <w:spacing w:before="0" w:after="0" w:line="240" w:lineRule="auto"/>
-        <w:ind w:left="113" w:right="113"/>
-        <w:jc w:val="left"/>
-      </w:pPr>
-      <w:r>
-        <w:rPr>
-          <w:rFonts w:ascii="Consolas" w:hAnsi="Consolas" w:cs="Courier New"/>
-          <w:sz w:val="18"/>
-          <w:szCs w:val="18"/>
-          <w:lang w:val="en-GB"/>
-        </w:rPr>
-        <w:t xml:space="preserve">    // private constructor: nobody outside can call "new BookingSystem()"</w:t>
-      </w:r>
-    </w:p>
-    <w:p>
-      <w:pPr>
-        <w:keepNext/>
-        <w:keepLines/>
-        <w:pBdr>
-          <w:top w:val="single" w:sz="4" w:space="4" w:color="BFBFBF"/>
-          <w:left w:val="single" w:sz="4" w:space="4" w:color="BFBFBF"/>
-          <w:bottom w:val="single" w:sz="4" w:space="4" w:color="BFBFBF"/>
-          <w:right w:val="single" w:sz="4" w:space="4" w:color="BFBFBF"/>
-        </w:pBdr>
-        <w:shd w:val="clear" w:color="auto" w:fill="F5F5F5"/>
-        <w:spacing w:before="0" w:after="0" w:line="240" w:lineRule="auto"/>
-        <w:ind w:left="113" w:right="113"/>
-        <w:jc w:val="left"/>
-      </w:pPr>
-      <w:r>
-        <w:rPr>
-          <w:rFonts w:ascii="Consolas" w:hAnsi="Consolas" w:cs="Courier New"/>
-          <w:sz w:val="18"/>
-          <w:szCs w:val="18"/>
-          <w:lang w:val="en-GB"/>
-        </w:rPr>
-        <w:t xml:space="preserve">    private BookingSystem() {</w:t>
-      </w:r>
-    </w:p>
-    <w:p>
-      <w:pPr>
-        <w:keepNext/>
-        <w:keepLines/>
-        <w:pBdr>
-          <w:top w:val="single" w:sz="4" w:space="4" w:color="BFBFBF"/>
-          <w:left w:val="single" w:sz="4" w:space="4" w:color="BFBFBF"/>
-          <w:bottom w:val="single" w:sz="4" w:space="4" w:color="BFBFBF"/>
-          <w:right w:val="single" w:sz="4" w:space="4" w:color="BFBFBF"/>
-        </w:pBdr>
-        <w:shd w:val="clear" w:color="auto" w:fill="F5F5F5"/>
-        <w:spacing w:before="0" w:after="0" w:line="240" w:lineRule="auto"/>
-        <w:ind w:left="113" w:right="113"/>
-        <w:jc w:val="left"/>
-      </w:pPr>
-      <w:r>
-        <w:rPr>
-          <w:rFonts w:ascii="Consolas" w:hAnsi="Consolas" w:cs="Courier New"/>
-          <w:sz w:val="18"/>
-          <w:szCs w:val="18"/>
-          <w:lang w:val="en-GB"/>
-        </w:rPr>
-        <w:t xml:space="preserve">        System.out.println("[BookingSystem] Single instance created");</w:t>
-      </w:r>
-    </w:p>
-    <w:p>
-      <w:pPr>
-        <w:keepNext/>
-        <w:keepLines/>
-        <w:pBdr>
-          <w:top w:val="single" w:sz="4" w:space="4" w:color="BFBFBF"/>
-          <w:left w:val="single" w:sz="4" w:space="4" w:color="BFBFBF"/>
-          <w:bottom w:val="single" w:sz="4" w:space="4" w:color="BFBFBF"/>
-          <w:right w:val="single" w:sz="4" w:space="4" w:color="BFBFBF"/>
-        </w:pBdr>
-        <w:shd w:val="clear" w:color="auto" w:fill="F5F5F5"/>
-        <w:spacing w:before="0" w:after="0" w:line="240" w:lineRule="auto"/>
-        <w:ind w:left="113" w:right="113"/>
-        <w:jc w:val="left"/>
-      </w:pPr>
-      <w:r>
-        <w:rPr>
-          <w:rFonts w:ascii="Consolas" w:hAnsi="Consolas" w:cs="Courier New"/>
-          <w:sz w:val="18"/>
-          <w:szCs w:val="18"/>
-          <w:lang w:val="en-GB"/>
-        </w:rPr>
-        <w:t xml:space="preserve">    }</w:t>
-      </w:r>
-    </w:p>
-    <w:p>
-      <w:pPr>
-        <w:keepNext/>
-        <w:keepLines/>
-        <w:pBdr>
-          <w:top w:val="single" w:sz="4" w:space="4" w:color="BFBFBF"/>
-          <w:left w:val="single" w:sz="4" w:space="4" w:color="BFBFBF"/>
-          <w:bottom w:val="single" w:sz="4" w:space="4" w:color="BFBFBF"/>
-          <w:right w:val="single" w:sz="4" w:space="4" w:color="BFBFBF"/>
-        </w:pBdr>
-        <w:shd w:val="clear" w:color="auto" w:fill="F5F5F5"/>
-        <w:spacing w:before="0" w:after="0" w:line="240" w:lineRule="auto"/>
-        <w:ind w:left="113" w:right="113"/>
-        <w:jc w:val="left"/>
-      </w:pPr>
-      <w:r>
-        <w:rPr>
-          <w:rFonts w:ascii="Consolas" w:hAnsi="Consolas" w:cs="Courier New"/>
-          <w:sz w:val="18"/>
-          <w:szCs w:val="18"/>
-          <w:lang w:val="en-GB"/>
-        </w:rPr>
-        <w:t xml:space="preserve"> </w:t>
-      </w:r>
-    </w:p>
-    <w:p>
-      <w:pPr>
-        <w:keepNext/>
-        <w:keepLines/>
-        <w:pBdr>
-          <w:top w:val="single" w:sz="4" w:space="4" w:color="BFBFBF"/>
-          <w:left w:val="single" w:sz="4" w:space="4" w:color="BFBFBF"/>
-          <w:bottom w:val="single" w:sz="4" w:space="4" w:color="BFBFBF"/>
-          <w:right w:val="single" w:sz="4" w:space="4" w:color="BFBFBF"/>
-        </w:pBdr>
-        <w:shd w:val="clear" w:color="auto" w:fill="F5F5F5"/>
-        <w:spacing w:before="0" w:after="0" w:line="240" w:lineRule="auto"/>
-        <w:ind w:left="113" w:right="113"/>
-        <w:jc w:val="left"/>
-      </w:pPr>
-      <w:r>
-        <w:rPr>
-          <w:rFonts w:ascii="Consolas" w:hAnsi="Consolas" w:cs="Courier New"/>
-          <w:sz w:val="18"/>
-          <w:szCs w:val="18"/>
-          <w:lang w:val="en-GB"/>
-        </w:rPr>
-        <w:t xml:space="preserve">    // thread-safe lazy initialization with double-checked locking</w:t>
-      </w:r>
-    </w:p>
-    <w:p>
-      <w:pPr>
-        <w:keepNext/>
-        <w:keepLines/>
-        <w:pBdr>
-          <w:top w:val="single" w:sz="4" w:space="4" w:color="BFBFBF"/>
-          <w:left w:val="single" w:sz="4" w:space="4" w:color="BFBFBF"/>
-          <w:bottom w:val="single" w:sz="4" w:space="4" w:color="BFBFBF"/>
-          <w:right w:val="single" w:sz="4" w:space="4" w:color="BFBFBF"/>
-        </w:pBdr>
-        <w:shd w:val="clear" w:color="auto" w:fill="F5F5F5"/>
-        <w:spacing w:before="0" w:after="0" w:line="240" w:lineRule="auto"/>
-        <w:ind w:left="113" w:right="113"/>
-        <w:jc w:val="left"/>
-      </w:pPr>
-      <w:r>
-        <w:rPr>
-          <w:rFonts w:ascii="Consolas" w:hAnsi="Consolas" w:cs="Courier New"/>
-          <w:sz w:val="18"/>
-          <w:szCs w:val="18"/>
-          <w:lang w:val="en-GB"/>
-        </w:rPr>
-        <w:t xml:space="preserve">    public static BookingSystem getInstance() {</w:t>
-      </w:r>
-    </w:p>
-    <w:p>
-      <w:pPr>
-        <w:keepNext/>
-        <w:keepLines/>
-        <w:pBdr>
-          <w:top w:val="single" w:sz="4" w:space="4" w:color="BFBFBF"/>
-          <w:left w:val="single" w:sz="4" w:space="4" w:color="BFBFBF"/>
-          <w:bottom w:val="single" w:sz="4" w:space="4" w:color="BFBFBF"/>
-          <w:right w:val="single" w:sz="4" w:space="4" w:color="BFBFBF"/>
-        </w:pBdr>
-        <w:shd w:val="clear" w:color="auto" w:fill="F5F5F5"/>
-        <w:spacing w:before="0" w:after="0" w:line="240" w:lineRule="auto"/>
-        <w:ind w:left="113" w:right="113"/>
-        <w:jc w:val="left"/>
-      </w:pPr>
-      <w:r>
-        <w:rPr>
-          <w:rFonts w:ascii="Consolas" w:hAnsi="Consolas" w:cs="Courier New"/>
-          <w:sz w:val="18"/>
-          <w:szCs w:val="18"/>
-          <w:lang w:val="en-GB"/>
-        </w:rPr>
-        <w:t xml:space="preserve">        if (instance == null) {</w:t>
-      </w:r>
-    </w:p>
-    <w:p>
-      <w:pPr>
-        <w:keepNext/>
-        <w:keepLines/>
-        <w:pBdr>
-          <w:top w:val="single" w:sz="4" w:space="4" w:color="BFBFBF"/>
-          <w:left w:val="single" w:sz="4" w:space="4" w:color="BFBFBF"/>
-          <w:bottom w:val="single" w:sz="4" w:space="4" w:color="BFBFBF"/>
-          <w:right w:val="single" w:sz="4" w:space="4" w:color="BFBFBF"/>
-        </w:pBdr>
-        <w:shd w:val="clear" w:color="auto" w:fill="F5F5F5"/>
-        <w:spacing w:before="0" w:after="0" w:line="240" w:lineRule="auto"/>
-        <w:ind w:left="113" w:right="113"/>
-        <w:jc w:val="left"/>
-      </w:pPr>
-      <w:r>
-        <w:rPr>
-          <w:rFonts w:ascii="Consolas" w:hAnsi="Consolas" w:cs="Courier New"/>
-          <w:sz w:val="18"/>
-          <w:szCs w:val="18"/>
-          <w:lang w:val="en-GB"/>
-        </w:rPr>
-        <w:t xml:space="preserve">            synchronized (BookingSystem.class) {</w:t>
-      </w:r>
-    </w:p>
-    <w:p>
-      <w:pPr>
-        <w:keepNext/>
-        <w:keepLines/>
-        <w:pBdr>
-          <w:top w:val="single" w:sz="4" w:space="4" w:color="BFBFBF"/>
-          <w:left w:val="single" w:sz="4" w:space="4" w:color="BFBFBF"/>
-          <w:bottom w:val="single" w:sz="4" w:space="4" w:color="BFBFBF"/>
-          <w:right w:val="single" w:sz="4" w:space="4" w:color="BFBFBF"/>
-        </w:pBdr>
-        <w:shd w:val="clear" w:color="auto" w:fill="F5F5F5"/>
-        <w:spacing w:before="0" w:after="0" w:line="240" w:lineRule="auto"/>
-        <w:ind w:left="113" w:right="113"/>
-        <w:jc w:val="left"/>
-      </w:pPr>
-      <w:r>
-        <w:rPr>
-          <w:rFonts w:ascii="Consolas" w:hAnsi="Consolas" w:cs="Courier New"/>
-          <w:sz w:val="18"/>
-          <w:szCs w:val="18"/>
-          <w:lang w:val="en-GB"/>
-        </w:rPr>
-        <w:t xml:space="preserve">                if (instance == null) {</w:t>
-      </w:r>
-    </w:p>
-    <w:p>
-      <w:pPr>
-        <w:keepNext/>
-        <w:keepLines/>
-        <w:pBdr>
-          <w:top w:val="single" w:sz="4" w:space="4" w:color="BFBFBF"/>
-          <w:left w:val="single" w:sz="4" w:space="4" w:color="BFBFBF"/>
-          <w:bottom w:val="single" w:sz="4" w:space="4" w:color="BFBFBF"/>
-          <w:right w:val="single" w:sz="4" w:space="4" w:color="BFBFBF"/>
-        </w:pBdr>
-        <w:shd w:val="clear" w:color="auto" w:fill="F5F5F5"/>
-        <w:spacing w:before="0" w:after="0" w:line="240" w:lineRule="auto"/>
-        <w:ind w:left="113" w:right="113"/>
-        <w:jc w:val="left"/>
-      </w:pPr>
-      <w:r>
-        <w:rPr>
-          <w:rFonts w:ascii="Consolas" w:hAnsi="Consolas" w:cs="Courier New"/>
-          <w:sz w:val="18"/>
-          <w:szCs w:val="18"/>
-          <w:lang w:val="en-GB"/>
-        </w:rPr>
-        <w:t xml:space="preserve">                    instance = new BookingSystem();</w:t>
-      </w:r>
-    </w:p>
-    <w:p>
-      <w:pPr>
-        <w:keepNext/>
-        <w:keepLines/>
-        <w:pBdr>
-          <w:top w:val="single" w:sz="4" w:space="4" w:color="BFBFBF"/>
-          <w:left w:val="single" w:sz="4" w:space="4" w:color="BFBFBF"/>
-          <w:bottom w:val="single" w:sz="4" w:space="4" w:color="BFBFBF"/>
-          <w:right w:val="single" w:sz="4" w:space="4" w:color="BFBFBF"/>
-        </w:pBdr>
-        <w:shd w:val="clear" w:color="auto" w:fill="F5F5F5"/>
-        <w:spacing w:before="0" w:after="0" w:line="240" w:lineRule="auto"/>
-        <w:ind w:left="113" w:right="113"/>
-        <w:jc w:val="left"/>
-      </w:pPr>
-      <w:r>
-        <w:rPr>
-          <w:rFonts w:ascii="Consolas" w:hAnsi="Consolas" w:cs="Courier New"/>
-          <w:sz w:val="18"/>
-          <w:szCs w:val="18"/>
-          <w:lang w:val="en-GB"/>
-        </w:rPr>
-        <w:t xml:space="preserve">                }</w:t>
-      </w:r>
-    </w:p>
-    <w:p>
-      <w:pPr>
-        <w:keepNext/>
-        <w:keepLines/>
-        <w:pBdr>
-          <w:top w:val="single" w:sz="4" w:space="4" w:color="BFBFBF"/>
-          <w:left w:val="single" w:sz="4" w:space="4" w:color="BFBFBF"/>
-          <w:bottom w:val="single" w:sz="4" w:space="4" w:color="BFBFBF"/>
-          <w:right w:val="single" w:sz="4" w:space="4" w:color="BFBFBF"/>
-        </w:pBdr>
-        <w:shd w:val="clear" w:color="auto" w:fill="F5F5F5"/>
-        <w:spacing w:before="0" w:after="0" w:line="240" w:lineRule="auto"/>
-        <w:ind w:left="113" w:right="113"/>
-        <w:jc w:val="left"/>
-      </w:pPr>
-      <w:r>
-        <w:rPr>
-          <w:rFonts w:ascii="Consolas" w:hAnsi="Consolas" w:cs="Courier New"/>
-          <w:sz w:val="18"/>
-          <w:szCs w:val="18"/>
-          <w:lang w:val="en-GB"/>
-        </w:rPr>
-        <w:t xml:space="preserve">            }</w:t>
-      </w:r>
-    </w:p>
-    <w:p>
-      <w:pPr>
-        <w:keepNext/>
-        <w:keepLines/>
-        <w:pBdr>
-          <w:top w:val="single" w:sz="4" w:space="4" w:color="BFBFBF"/>
-          <w:left w:val="single" w:sz="4" w:space="4" w:color="BFBFBF"/>
-          <w:bottom w:val="single" w:sz="4" w:space="4" w:color="BFBFBF"/>
-          <w:right w:val="single" w:sz="4" w:space="4" w:color="BFBFBF"/>
-        </w:pBdr>
-        <w:shd w:val="clear" w:color="auto" w:fill="F5F5F5"/>
-        <w:spacing w:before="0" w:after="0" w:line="240" w:lineRule="auto"/>
-        <w:ind w:left="113" w:right="113"/>
-        <w:jc w:val="left"/>
-      </w:pPr>
-      <w:r>
-        <w:rPr>
-          <w:rFonts w:ascii="Consolas" w:hAnsi="Consolas" w:cs="Courier New"/>
-          <w:sz w:val="18"/>
-          <w:szCs w:val="18"/>
-          <w:lang w:val="en-GB"/>
-        </w:rPr>
-        <w:t xml:space="preserve">        }</w:t>
-      </w:r>
-    </w:p>
-    <w:p>
-      <w:pPr>
-        <w:keepNext/>
-        <w:keepLines/>
-        <w:pBdr>
-          <w:top w:val="single" w:sz="4" w:space="4" w:color="BFBFBF"/>
-          <w:left w:val="single" w:sz="4" w:space="4" w:color="BFBFBF"/>
-          <w:bottom w:val="single" w:sz="4" w:space="4" w:color="BFBFBF"/>
-          <w:right w:val="single" w:sz="4" w:space="4" w:color="BFBFBF"/>
-        </w:pBdr>
-        <w:shd w:val="clear" w:color="auto" w:fill="F5F5F5"/>
-        <w:spacing w:before="0" w:after="0" w:line="240" w:lineRule="auto"/>
-        <w:ind w:left="113" w:right="113"/>
-        <w:jc w:val="left"/>
-      </w:pPr>
-      <w:r>
-        <w:rPr>
-          <w:rFonts w:ascii="Consolas" w:hAnsi="Consolas" w:cs="Courier New"/>
-          <w:sz w:val="18"/>
-          <w:szCs w:val="18"/>
-          <w:lang w:val="en-GB"/>
-        </w:rPr>
-        <w:t xml:space="preserve">        return instance;</w:t>
-      </w:r>
-    </w:p>
-    <w:p>
-      <w:pPr>
-        <w:keepLines/>
-        <w:pBdr>
-          <w:top w:val="single" w:sz="4" w:space="4" w:color="BFBFBF"/>
-          <w:left w:val="single" w:sz="4" w:space="4" w:color="BFBFBF"/>
-          <w:bottom w:val="single" w:sz="4" w:space="4" w:color="BFBFBF"/>
-          <w:right w:val="single" w:sz="4" w:space="4" w:color="BFBFBF"/>
-        </w:pBdr>
-        <w:shd w:val="clear" w:color="auto" w:fill="F5F5F5"/>
-        <w:spacing w:before="0" w:after="200" w:line="240" w:lineRule="auto"/>
-        <w:ind w:left="113" w:right="113"/>
-        <w:jc w:val="left"/>
-      </w:pPr>
-      <w:r>
-        <w:rPr>
-          <w:rFonts w:ascii="Consolas" w:hAnsi="Consolas" w:cs="Courier New"/>
-          <w:sz w:val="18"/>
-          <w:szCs w:val="18"/>
-          <w:lang w:val="en-GB"/>
-        </w:rPr>
-        <w:t xml:space="preserve">    }</w:t>
-      </w:r>
-    </w:p>
-    <w:p>
-      <w:pPr>
-        <w:pStyle w:val="NoSpacing"/>
-        <w:keepNext/>
-        <w:spacing w:after="120"/>
-      </w:pPr>
-      <w:r>
-        <w:rPr>
-          <w:lang w:val="en-GB"/>
-        </w:rPr>
-        <w:t xml:space="preserve">Because there is only one booking system, it can enforce a rule that would be impossible with several copies: a room cannot be booked twice for overlapping dates. Its methods are </w:t>
+        <w:t xml:space="preserve"> field. That makes the creation thread-safe while avoiding a lock on every call after the instance exists. The </w:t>
       </w:r>
       <w:r>
         <w:rPr>
@@ -4659,200 +4128,13 @@
           <w:shd w:val="clear" w:color="auto" w:fill="F2F2F2"/>
           <w:lang w:val="en-GB"/>
         </w:rPr>
-        <w:t xml:space="preserve">synchronized</w:t>
-      </w:r>
-      <w:r>
-        <w:rPr>
-          <w:lang w:val="en-GB"/>
-        </w:rPr>
-        <w:t xml:space="preserve">, so two desks booking at the same time cannot both get the same room.</w:t>
-      </w:r>
-    </w:p>
-    <w:p>
-      <w:pPr>
-        <w:keepNext/>
-        <w:keepLines/>
-        <w:pBdr>
-          <w:top w:val="single" w:sz="4" w:space="4" w:color="BFBFBF"/>
-          <w:left w:val="single" w:sz="4" w:space="4" w:color="BFBFBF"/>
-          <w:bottom w:val="single" w:sz="4" w:space="4" w:color="BFBFBF"/>
-          <w:right w:val="single" w:sz="4" w:space="4" w:color="BFBFBF"/>
-        </w:pBdr>
-        <w:shd w:val="clear" w:color="auto" w:fill="F5F5F5"/>
-        <w:spacing w:before="120" w:after="0" w:line="240" w:lineRule="auto"/>
-        <w:ind w:left="113" w:right="113"/>
-        <w:jc w:val="left"/>
-      </w:pPr>
-      <w:r>
-        <w:rPr>
-          <w:rFonts w:ascii="Consolas" w:hAnsi="Consolas" w:cs="Courier New"/>
-          <w:sz w:val="18"/>
-          <w:szCs w:val="18"/>
-          <w:lang w:val="en-GB"/>
-        </w:rPr>
-        <w:t xml:space="preserve">public synchronized boolean book(Reservation reservation) {</w:t>
-      </w:r>
-    </w:p>
-    <w:p>
-      <w:pPr>
-        <w:keepNext/>
-        <w:keepLines/>
-        <w:pBdr>
-          <w:top w:val="single" w:sz="4" w:space="4" w:color="BFBFBF"/>
-          <w:left w:val="single" w:sz="4" w:space="4" w:color="BFBFBF"/>
-          <w:bottom w:val="single" w:sz="4" w:space="4" w:color="BFBFBF"/>
-          <w:right w:val="single" w:sz="4" w:space="4" w:color="BFBFBF"/>
-        </w:pBdr>
-        <w:shd w:val="clear" w:color="auto" w:fill="F5F5F5"/>
-        <w:spacing w:before="0" w:after="0" w:line="240" w:lineRule="auto"/>
-        <w:ind w:left="113" w:right="113"/>
-        <w:jc w:val="left"/>
-      </w:pPr>
-      <w:r>
-        <w:rPr>
-          <w:rFonts w:ascii="Consolas" w:hAnsi="Consolas" w:cs="Courier New"/>
-          <w:sz w:val="18"/>
-          <w:szCs w:val="18"/>
-          <w:lang w:val="en-GB"/>
-        </w:rPr>
-        <w:t xml:space="preserve">    if (!isAvailable(reservation.getRoom(), reservation.getCheckIn(), reservation.getCheckOut())) {</w:t>
-      </w:r>
-    </w:p>
-    <w:p>
-      <w:pPr>
-        <w:keepNext/>
-        <w:keepLines/>
-        <w:pBdr>
-          <w:top w:val="single" w:sz="4" w:space="4" w:color="BFBFBF"/>
-          <w:left w:val="single" w:sz="4" w:space="4" w:color="BFBFBF"/>
-          <w:bottom w:val="single" w:sz="4" w:space="4" w:color="BFBFBF"/>
-          <w:right w:val="single" w:sz="4" w:space="4" w:color="BFBFBF"/>
-        </w:pBdr>
-        <w:shd w:val="clear" w:color="auto" w:fill="F5F5F5"/>
-        <w:spacing w:before="0" w:after="0" w:line="240" w:lineRule="auto"/>
-        <w:ind w:left="113" w:right="113"/>
-        <w:jc w:val="left"/>
-      </w:pPr>
-      <w:r>
-        <w:rPr>
-          <w:rFonts w:ascii="Consolas" w:hAnsi="Consolas" w:cs="Courier New"/>
-          <w:sz w:val="18"/>
-          <w:szCs w:val="18"/>
-          <w:lang w:val="en-GB"/>
-        </w:rPr>
-        <w:t xml:space="preserve">        return false;</w:t>
-      </w:r>
-    </w:p>
-    <w:p>
-      <w:pPr>
-        <w:keepNext/>
-        <w:keepLines/>
-        <w:pBdr>
-          <w:top w:val="single" w:sz="4" w:space="4" w:color="BFBFBF"/>
-          <w:left w:val="single" w:sz="4" w:space="4" w:color="BFBFBF"/>
-          <w:bottom w:val="single" w:sz="4" w:space="4" w:color="BFBFBF"/>
-          <w:right w:val="single" w:sz="4" w:space="4" w:color="BFBFBF"/>
-        </w:pBdr>
-        <w:shd w:val="clear" w:color="auto" w:fill="F5F5F5"/>
-        <w:spacing w:before="0" w:after="0" w:line="240" w:lineRule="auto"/>
-        <w:ind w:left="113" w:right="113"/>
-        <w:jc w:val="left"/>
-      </w:pPr>
-      <w:r>
-        <w:rPr>
-          <w:rFonts w:ascii="Consolas" w:hAnsi="Consolas" w:cs="Courier New"/>
-          <w:sz w:val="18"/>
-          <w:szCs w:val="18"/>
-          <w:lang w:val="en-GB"/>
-        </w:rPr>
-        <w:t xml:space="preserve">    }</w:t>
-      </w:r>
-    </w:p>
-    <w:p>
-      <w:pPr>
-        <w:keepNext/>
-        <w:keepLines/>
-        <w:pBdr>
-          <w:top w:val="single" w:sz="4" w:space="4" w:color="BFBFBF"/>
-          <w:left w:val="single" w:sz="4" w:space="4" w:color="BFBFBF"/>
-          <w:bottom w:val="single" w:sz="4" w:space="4" w:color="BFBFBF"/>
-          <w:right w:val="single" w:sz="4" w:space="4" w:color="BFBFBF"/>
-        </w:pBdr>
-        <w:shd w:val="clear" w:color="auto" w:fill="F5F5F5"/>
-        <w:spacing w:before="0" w:after="0" w:line="240" w:lineRule="auto"/>
-        <w:ind w:left="113" w:right="113"/>
-        <w:jc w:val="left"/>
-      </w:pPr>
-      <w:r>
-        <w:rPr>
-          <w:rFonts w:ascii="Consolas" w:hAnsi="Consolas" w:cs="Courier New"/>
-          <w:sz w:val="18"/>
-          <w:szCs w:val="18"/>
-          <w:lang w:val="en-GB"/>
-        </w:rPr>
-        <w:t xml:space="preserve">    reservations.add(reservation);</w:t>
-      </w:r>
-    </w:p>
-    <w:p>
-      <w:pPr>
-        <w:keepNext/>
-        <w:keepLines/>
-        <w:pBdr>
-          <w:top w:val="single" w:sz="4" w:space="4" w:color="BFBFBF"/>
-          <w:left w:val="single" w:sz="4" w:space="4" w:color="BFBFBF"/>
-          <w:bottom w:val="single" w:sz="4" w:space="4" w:color="BFBFBF"/>
-          <w:right w:val="single" w:sz="4" w:space="4" w:color="BFBFBF"/>
-        </w:pBdr>
-        <w:shd w:val="clear" w:color="auto" w:fill="F5F5F5"/>
-        <w:spacing w:before="0" w:after="0" w:line="240" w:lineRule="auto"/>
-        <w:ind w:left="113" w:right="113"/>
-        <w:jc w:val="left"/>
-      </w:pPr>
-      <w:r>
-        <w:rPr>
-          <w:rFonts w:ascii="Consolas" w:hAnsi="Consolas" w:cs="Courier New"/>
-          <w:sz w:val="18"/>
-          <w:szCs w:val="18"/>
-          <w:lang w:val="en-GB"/>
-        </w:rPr>
-        <w:t xml:space="preserve">    return true;</w:t>
-      </w:r>
-    </w:p>
-    <w:p>
-      <w:pPr>
-        <w:keepLines/>
-        <w:pBdr>
-          <w:top w:val="single" w:sz="4" w:space="4" w:color="BFBFBF"/>
-          <w:left w:val="single" w:sz="4" w:space="4" w:color="BFBFBF"/>
-          <w:bottom w:val="single" w:sz="4" w:space="4" w:color="BFBFBF"/>
-          <w:right w:val="single" w:sz="4" w:space="4" w:color="BFBFBF"/>
-        </w:pBdr>
-        <w:shd w:val="clear" w:color="auto" w:fill="F5F5F5"/>
-        <w:spacing w:before="0" w:after="200" w:line="240" w:lineRule="auto"/>
-        <w:ind w:left="113" w:right="113"/>
-        <w:jc w:val="left"/>
-      </w:pPr>
-      <w:r>
-        <w:rPr>
-          <w:rFonts w:ascii="Consolas" w:hAnsi="Consolas" w:cs="Courier New"/>
-          <w:sz w:val="18"/>
-          <w:szCs w:val="18"/>
-          <w:lang w:val="en-GB"/>
-        </w:rPr>
-        <w:t xml:space="preserve">}</w:t>
-      </w:r>
-    </w:p>
-    <w:p>
-      <w:pPr>
-        <w:pStyle w:val="NoSpacing"/>
-        <w:keepNext/>
-        <w:spacing w:after="120"/>
-      </w:pPr>
-      <w:r>
-        <w:rPr>
-          <w:lang w:val="en-GB"/>
-        </w:rPr>
-        <w:t xml:space="preserve">The client checks thread safety by starting 5 threads ("reception desks") that call </w:t>
+        <w:t xml:space="preserve">next()</w:t>
+      </w:r>
+      <w:r>
+        <w:rPr>
+          <w:lang w:val="en-GB"/>
+        </w:rPr>
+        <w:t xml:space="preserve"> method is </w:t>
       </w:r>
       <w:r>
         <w:rPr>
@@ -4862,12 +4144,1247 @@
           <w:shd w:val="clear" w:color="auto" w:fill="F2F2F2"/>
           <w:lang w:val="en-GB"/>
         </w:rPr>
+        <w:t xml:space="preserve">synchronized</w:t>
+      </w:r>
+      <w:r>
+        <w:rPr>
+          <w:lang w:val="en-GB"/>
+        </w:rPr>
+        <w:t xml:space="preserve">, so two desks booking at the same moment can never receive the same code.</w:t>
+      </w:r>
+    </w:p>
+    <w:p>
+      <w:pPr>
+        <w:keepNext/>
+        <w:keepLines/>
+        <w:pBdr>
+          <w:top w:val="single" w:sz="4" w:space="4" w:color="BFBFBF"/>
+          <w:left w:val="single" w:sz="4" w:space="4" w:color="BFBFBF"/>
+          <w:bottom w:val="single" w:sz="4" w:space="4" w:color="BFBFBF"/>
+          <w:right w:val="single" w:sz="4" w:space="4" w:color="BFBFBF"/>
+        </w:pBdr>
+        <w:shd w:val="clear" w:color="auto" w:fill="F5F5F5"/>
+        <w:spacing w:before="120" w:after="0" w:line="240" w:lineRule="auto"/>
+        <w:ind w:left="113" w:right="113"/>
+        <w:jc w:val="left"/>
+      </w:pPr>
+      <w:r>
+        <w:rPr>
+          <w:rFonts w:ascii="Consolas" w:hAnsi="Consolas" w:cs="Courier New"/>
+          <w:sz w:val="18"/>
+          <w:szCs w:val="18"/>
+          <w:lang w:val="en-GB"/>
+        </w:rPr>
+        <w:t xml:space="preserve">public final class ReservationNumberGenerator {</w:t>
+      </w:r>
+    </w:p>
+    <w:p>
+      <w:pPr>
+        <w:keepNext/>
+        <w:keepLines/>
+        <w:pBdr>
+          <w:top w:val="single" w:sz="4" w:space="4" w:color="BFBFBF"/>
+          <w:left w:val="single" w:sz="4" w:space="4" w:color="BFBFBF"/>
+          <w:bottom w:val="single" w:sz="4" w:space="4" w:color="BFBFBF"/>
+          <w:right w:val="single" w:sz="4" w:space="4" w:color="BFBFBF"/>
+        </w:pBdr>
+        <w:shd w:val="clear" w:color="auto" w:fill="F5F5F5"/>
+        <w:spacing w:before="0" w:after="0" w:line="240" w:lineRule="auto"/>
+        <w:ind w:left="113" w:right="113"/>
+        <w:jc w:val="left"/>
+      </w:pPr>
+      <w:r>
+        <w:rPr>
+          <w:rFonts w:ascii="Consolas" w:hAnsi="Consolas" w:cs="Courier New"/>
+          <w:sz w:val="18"/>
+          <w:szCs w:val="18"/>
+          <w:lang w:val="en-GB"/>
+        </w:rPr>
+        <w:t xml:space="preserve"> </w:t>
+      </w:r>
+    </w:p>
+    <w:p>
+      <w:pPr>
+        <w:keepNext/>
+        <w:keepLines/>
+        <w:pBdr>
+          <w:top w:val="single" w:sz="4" w:space="4" w:color="BFBFBF"/>
+          <w:left w:val="single" w:sz="4" w:space="4" w:color="BFBFBF"/>
+          <w:bottom w:val="single" w:sz="4" w:space="4" w:color="BFBFBF"/>
+          <w:right w:val="single" w:sz="4" w:space="4" w:color="BFBFBF"/>
+        </w:pBdr>
+        <w:shd w:val="clear" w:color="auto" w:fill="F5F5F5"/>
+        <w:spacing w:before="0" w:after="0" w:line="240" w:lineRule="auto"/>
+        <w:ind w:left="113" w:right="113"/>
+        <w:jc w:val="left"/>
+      </w:pPr>
+      <w:r>
+        <w:rPr>
+          <w:rFonts w:ascii="Consolas" w:hAnsi="Consolas" w:cs="Courier New"/>
+          <w:sz w:val="18"/>
+          <w:szCs w:val="18"/>
+          <w:lang w:val="en-GB"/>
+        </w:rPr>
+        <w:t xml:space="preserve">    // volatile: every thread sees the fully constructed instance</w:t>
+      </w:r>
+    </w:p>
+    <w:p>
+      <w:pPr>
+        <w:keepNext/>
+        <w:keepLines/>
+        <w:pBdr>
+          <w:top w:val="single" w:sz="4" w:space="4" w:color="BFBFBF"/>
+          <w:left w:val="single" w:sz="4" w:space="4" w:color="BFBFBF"/>
+          <w:bottom w:val="single" w:sz="4" w:space="4" w:color="BFBFBF"/>
+          <w:right w:val="single" w:sz="4" w:space="4" w:color="BFBFBF"/>
+        </w:pBdr>
+        <w:shd w:val="clear" w:color="auto" w:fill="F5F5F5"/>
+        <w:spacing w:before="0" w:after="0" w:line="240" w:lineRule="auto"/>
+        <w:ind w:left="113" w:right="113"/>
+        <w:jc w:val="left"/>
+      </w:pPr>
+      <w:r>
+        <w:rPr>
+          <w:rFonts w:ascii="Consolas" w:hAnsi="Consolas" w:cs="Courier New"/>
+          <w:sz w:val="18"/>
+          <w:szCs w:val="18"/>
+          <w:lang w:val="en-GB"/>
+        </w:rPr>
+        <w:t xml:space="preserve">    private static volatile ReservationNumberGenerator instance;</w:t>
+      </w:r>
+    </w:p>
+    <w:p>
+      <w:pPr>
+        <w:keepNext/>
+        <w:keepLines/>
+        <w:pBdr>
+          <w:top w:val="single" w:sz="4" w:space="4" w:color="BFBFBF"/>
+          <w:left w:val="single" w:sz="4" w:space="4" w:color="BFBFBF"/>
+          <w:bottom w:val="single" w:sz="4" w:space="4" w:color="BFBFBF"/>
+          <w:right w:val="single" w:sz="4" w:space="4" w:color="BFBFBF"/>
+        </w:pBdr>
+        <w:shd w:val="clear" w:color="auto" w:fill="F5F5F5"/>
+        <w:spacing w:before="0" w:after="0" w:line="240" w:lineRule="auto"/>
+        <w:ind w:left="113" w:right="113"/>
+        <w:jc w:val="left"/>
+      </w:pPr>
+      <w:r>
+        <w:rPr>
+          <w:rFonts w:ascii="Consolas" w:hAnsi="Consolas" w:cs="Courier New"/>
+          <w:sz w:val="18"/>
+          <w:szCs w:val="18"/>
+          <w:lang w:val="en-GB"/>
+        </w:rPr>
+        <w:t xml:space="preserve"> </w:t>
+      </w:r>
+    </w:p>
+    <w:p>
+      <w:pPr>
+        <w:keepNext/>
+        <w:keepLines/>
+        <w:pBdr>
+          <w:top w:val="single" w:sz="4" w:space="4" w:color="BFBFBF"/>
+          <w:left w:val="single" w:sz="4" w:space="4" w:color="BFBFBF"/>
+          <w:bottom w:val="single" w:sz="4" w:space="4" w:color="BFBFBF"/>
+          <w:right w:val="single" w:sz="4" w:space="4" w:color="BFBFBF"/>
+        </w:pBdr>
+        <w:shd w:val="clear" w:color="auto" w:fill="F5F5F5"/>
+        <w:spacing w:before="0" w:after="0" w:line="240" w:lineRule="auto"/>
+        <w:ind w:left="113" w:right="113"/>
+        <w:jc w:val="left"/>
+      </w:pPr>
+      <w:r>
+        <w:rPr>
+          <w:rFonts w:ascii="Consolas" w:hAnsi="Consolas" w:cs="Courier New"/>
+          <w:sz w:val="18"/>
+          <w:szCs w:val="18"/>
+          <w:lang w:val="en-GB"/>
+        </w:rPr>
+        <w:t xml:space="preserve">    private int lastNumber = 0;</w:t>
+      </w:r>
+    </w:p>
+    <w:p>
+      <w:pPr>
+        <w:keepNext/>
+        <w:keepLines/>
+        <w:pBdr>
+          <w:top w:val="single" w:sz="4" w:space="4" w:color="BFBFBF"/>
+          <w:left w:val="single" w:sz="4" w:space="4" w:color="BFBFBF"/>
+          <w:bottom w:val="single" w:sz="4" w:space="4" w:color="BFBFBF"/>
+          <w:right w:val="single" w:sz="4" w:space="4" w:color="BFBFBF"/>
+        </w:pBdr>
+        <w:shd w:val="clear" w:color="auto" w:fill="F5F5F5"/>
+        <w:spacing w:before="0" w:after="0" w:line="240" w:lineRule="auto"/>
+        <w:ind w:left="113" w:right="113"/>
+        <w:jc w:val="left"/>
+      </w:pPr>
+      <w:r>
+        <w:rPr>
+          <w:rFonts w:ascii="Consolas" w:hAnsi="Consolas" w:cs="Courier New"/>
+          <w:sz w:val="18"/>
+          <w:szCs w:val="18"/>
+          <w:lang w:val="en-GB"/>
+        </w:rPr>
+        <w:t xml:space="preserve"> </w:t>
+      </w:r>
+    </w:p>
+    <w:p>
+      <w:pPr>
+        <w:keepNext/>
+        <w:keepLines/>
+        <w:pBdr>
+          <w:top w:val="single" w:sz="4" w:space="4" w:color="BFBFBF"/>
+          <w:left w:val="single" w:sz="4" w:space="4" w:color="BFBFBF"/>
+          <w:bottom w:val="single" w:sz="4" w:space="4" w:color="BFBFBF"/>
+          <w:right w:val="single" w:sz="4" w:space="4" w:color="BFBFBF"/>
+        </w:pBdr>
+        <w:shd w:val="clear" w:color="auto" w:fill="F5F5F5"/>
+        <w:spacing w:before="0" w:after="0" w:line="240" w:lineRule="auto"/>
+        <w:ind w:left="113" w:right="113"/>
+        <w:jc w:val="left"/>
+      </w:pPr>
+      <w:r>
+        <w:rPr>
+          <w:rFonts w:ascii="Consolas" w:hAnsi="Consolas" w:cs="Courier New"/>
+          <w:sz w:val="18"/>
+          <w:szCs w:val="18"/>
+          <w:lang w:val="en-GB"/>
+        </w:rPr>
+        <w:t xml:space="preserve">    // private constructor: nobody outside can call "new ReservationNumberGenerator()"</w:t>
+      </w:r>
+    </w:p>
+    <w:p>
+      <w:pPr>
+        <w:keepNext/>
+        <w:keepLines/>
+        <w:pBdr>
+          <w:top w:val="single" w:sz="4" w:space="4" w:color="BFBFBF"/>
+          <w:left w:val="single" w:sz="4" w:space="4" w:color="BFBFBF"/>
+          <w:bottom w:val="single" w:sz="4" w:space="4" w:color="BFBFBF"/>
+          <w:right w:val="single" w:sz="4" w:space="4" w:color="BFBFBF"/>
+        </w:pBdr>
+        <w:shd w:val="clear" w:color="auto" w:fill="F5F5F5"/>
+        <w:spacing w:before="0" w:after="0" w:line="240" w:lineRule="auto"/>
+        <w:ind w:left="113" w:right="113"/>
+        <w:jc w:val="left"/>
+      </w:pPr>
+      <w:r>
+        <w:rPr>
+          <w:rFonts w:ascii="Consolas" w:hAnsi="Consolas" w:cs="Courier New"/>
+          <w:sz w:val="18"/>
+          <w:szCs w:val="18"/>
+          <w:lang w:val="en-GB"/>
+        </w:rPr>
+        <w:t xml:space="preserve">    private ReservationNumberGenerator() {</w:t>
+      </w:r>
+    </w:p>
+    <w:p>
+      <w:pPr>
+        <w:keepNext/>
+        <w:keepLines/>
+        <w:pBdr>
+          <w:top w:val="single" w:sz="4" w:space="4" w:color="BFBFBF"/>
+          <w:left w:val="single" w:sz="4" w:space="4" w:color="BFBFBF"/>
+          <w:bottom w:val="single" w:sz="4" w:space="4" w:color="BFBFBF"/>
+          <w:right w:val="single" w:sz="4" w:space="4" w:color="BFBFBF"/>
+        </w:pBdr>
+        <w:shd w:val="clear" w:color="auto" w:fill="F5F5F5"/>
+        <w:spacing w:before="0" w:after="0" w:line="240" w:lineRule="auto"/>
+        <w:ind w:left="113" w:right="113"/>
+        <w:jc w:val="left"/>
+      </w:pPr>
+      <w:r>
+        <w:rPr>
+          <w:rFonts w:ascii="Consolas" w:hAnsi="Consolas" w:cs="Courier New"/>
+          <w:sz w:val="18"/>
+          <w:szCs w:val="18"/>
+          <w:lang w:val="en-GB"/>
+        </w:rPr>
+        <w:t xml:space="preserve">        System.out.println("[ReservationNumberGenerator] Single instance created");</w:t>
+      </w:r>
+    </w:p>
+    <w:p>
+      <w:pPr>
+        <w:keepNext/>
+        <w:keepLines/>
+        <w:pBdr>
+          <w:top w:val="single" w:sz="4" w:space="4" w:color="BFBFBF"/>
+          <w:left w:val="single" w:sz="4" w:space="4" w:color="BFBFBF"/>
+          <w:bottom w:val="single" w:sz="4" w:space="4" w:color="BFBFBF"/>
+          <w:right w:val="single" w:sz="4" w:space="4" w:color="BFBFBF"/>
+        </w:pBdr>
+        <w:shd w:val="clear" w:color="auto" w:fill="F5F5F5"/>
+        <w:spacing w:before="0" w:after="0" w:line="240" w:lineRule="auto"/>
+        <w:ind w:left="113" w:right="113"/>
+        <w:jc w:val="left"/>
+      </w:pPr>
+      <w:r>
+        <w:rPr>
+          <w:rFonts w:ascii="Consolas" w:hAnsi="Consolas" w:cs="Courier New"/>
+          <w:sz w:val="18"/>
+          <w:szCs w:val="18"/>
+          <w:lang w:val="en-GB"/>
+        </w:rPr>
+        <w:t xml:space="preserve">    }</w:t>
+      </w:r>
+    </w:p>
+    <w:p>
+      <w:pPr>
+        <w:keepNext/>
+        <w:keepLines/>
+        <w:pBdr>
+          <w:top w:val="single" w:sz="4" w:space="4" w:color="BFBFBF"/>
+          <w:left w:val="single" w:sz="4" w:space="4" w:color="BFBFBF"/>
+          <w:bottom w:val="single" w:sz="4" w:space="4" w:color="BFBFBF"/>
+          <w:right w:val="single" w:sz="4" w:space="4" w:color="BFBFBF"/>
+        </w:pBdr>
+        <w:shd w:val="clear" w:color="auto" w:fill="F5F5F5"/>
+        <w:spacing w:before="0" w:after="0" w:line="240" w:lineRule="auto"/>
+        <w:ind w:left="113" w:right="113"/>
+        <w:jc w:val="left"/>
+      </w:pPr>
+      <w:r>
+        <w:rPr>
+          <w:rFonts w:ascii="Consolas" w:hAnsi="Consolas" w:cs="Courier New"/>
+          <w:sz w:val="18"/>
+          <w:szCs w:val="18"/>
+          <w:lang w:val="en-GB"/>
+        </w:rPr>
+        <w:t xml:space="preserve"> </w:t>
+      </w:r>
+    </w:p>
+    <w:p>
+      <w:pPr>
+        <w:keepNext/>
+        <w:keepLines/>
+        <w:pBdr>
+          <w:top w:val="single" w:sz="4" w:space="4" w:color="BFBFBF"/>
+          <w:left w:val="single" w:sz="4" w:space="4" w:color="BFBFBF"/>
+          <w:bottom w:val="single" w:sz="4" w:space="4" w:color="BFBFBF"/>
+          <w:right w:val="single" w:sz="4" w:space="4" w:color="BFBFBF"/>
+        </w:pBdr>
+        <w:shd w:val="clear" w:color="auto" w:fill="F5F5F5"/>
+        <w:spacing w:before="0" w:after="0" w:line="240" w:lineRule="auto"/>
+        <w:ind w:left="113" w:right="113"/>
+        <w:jc w:val="left"/>
+      </w:pPr>
+      <w:r>
+        <w:rPr>
+          <w:rFonts w:ascii="Consolas" w:hAnsi="Consolas" w:cs="Courier New"/>
+          <w:sz w:val="18"/>
+          <w:szCs w:val="18"/>
+          <w:lang w:val="en-GB"/>
+        </w:rPr>
+        <w:t xml:space="preserve">    // thread-safe lazy initialization with double-checked locking</w:t>
+      </w:r>
+    </w:p>
+    <w:p>
+      <w:pPr>
+        <w:keepNext/>
+        <w:keepLines/>
+        <w:pBdr>
+          <w:top w:val="single" w:sz="4" w:space="4" w:color="BFBFBF"/>
+          <w:left w:val="single" w:sz="4" w:space="4" w:color="BFBFBF"/>
+          <w:bottom w:val="single" w:sz="4" w:space="4" w:color="BFBFBF"/>
+          <w:right w:val="single" w:sz="4" w:space="4" w:color="BFBFBF"/>
+        </w:pBdr>
+        <w:shd w:val="clear" w:color="auto" w:fill="F5F5F5"/>
+        <w:spacing w:before="0" w:after="0" w:line="240" w:lineRule="auto"/>
+        <w:ind w:left="113" w:right="113"/>
+        <w:jc w:val="left"/>
+      </w:pPr>
+      <w:r>
+        <w:rPr>
+          <w:rFonts w:ascii="Consolas" w:hAnsi="Consolas" w:cs="Courier New"/>
+          <w:sz w:val="18"/>
+          <w:szCs w:val="18"/>
+          <w:lang w:val="en-GB"/>
+        </w:rPr>
+        <w:t xml:space="preserve">    public static ReservationNumberGenerator getInstance() {</w:t>
+      </w:r>
+    </w:p>
+    <w:p>
+      <w:pPr>
+        <w:keepNext/>
+        <w:keepLines/>
+        <w:pBdr>
+          <w:top w:val="single" w:sz="4" w:space="4" w:color="BFBFBF"/>
+          <w:left w:val="single" w:sz="4" w:space="4" w:color="BFBFBF"/>
+          <w:bottom w:val="single" w:sz="4" w:space="4" w:color="BFBFBF"/>
+          <w:right w:val="single" w:sz="4" w:space="4" w:color="BFBFBF"/>
+        </w:pBdr>
+        <w:shd w:val="clear" w:color="auto" w:fill="F5F5F5"/>
+        <w:spacing w:before="0" w:after="0" w:line="240" w:lineRule="auto"/>
+        <w:ind w:left="113" w:right="113"/>
+        <w:jc w:val="left"/>
+      </w:pPr>
+      <w:r>
+        <w:rPr>
+          <w:rFonts w:ascii="Consolas" w:hAnsi="Consolas" w:cs="Courier New"/>
+          <w:sz w:val="18"/>
+          <w:szCs w:val="18"/>
+          <w:lang w:val="en-GB"/>
+        </w:rPr>
+        <w:t xml:space="preserve">        if (instance == null) {</w:t>
+      </w:r>
+    </w:p>
+    <w:p>
+      <w:pPr>
+        <w:keepNext/>
+        <w:keepLines/>
+        <w:pBdr>
+          <w:top w:val="single" w:sz="4" w:space="4" w:color="BFBFBF"/>
+          <w:left w:val="single" w:sz="4" w:space="4" w:color="BFBFBF"/>
+          <w:bottom w:val="single" w:sz="4" w:space="4" w:color="BFBFBF"/>
+          <w:right w:val="single" w:sz="4" w:space="4" w:color="BFBFBF"/>
+        </w:pBdr>
+        <w:shd w:val="clear" w:color="auto" w:fill="F5F5F5"/>
+        <w:spacing w:before="0" w:after="0" w:line="240" w:lineRule="auto"/>
+        <w:ind w:left="113" w:right="113"/>
+        <w:jc w:val="left"/>
+      </w:pPr>
+      <w:r>
+        <w:rPr>
+          <w:rFonts w:ascii="Consolas" w:hAnsi="Consolas" w:cs="Courier New"/>
+          <w:sz w:val="18"/>
+          <w:szCs w:val="18"/>
+          <w:lang w:val="en-GB"/>
+        </w:rPr>
+        <w:t xml:space="preserve">            synchronized (ReservationNumberGenerator.class) {</w:t>
+      </w:r>
+    </w:p>
+    <w:p>
+      <w:pPr>
+        <w:keepNext/>
+        <w:keepLines/>
+        <w:pBdr>
+          <w:top w:val="single" w:sz="4" w:space="4" w:color="BFBFBF"/>
+          <w:left w:val="single" w:sz="4" w:space="4" w:color="BFBFBF"/>
+          <w:bottom w:val="single" w:sz="4" w:space="4" w:color="BFBFBF"/>
+          <w:right w:val="single" w:sz="4" w:space="4" w:color="BFBFBF"/>
+        </w:pBdr>
+        <w:shd w:val="clear" w:color="auto" w:fill="F5F5F5"/>
+        <w:spacing w:before="0" w:after="0" w:line="240" w:lineRule="auto"/>
+        <w:ind w:left="113" w:right="113"/>
+        <w:jc w:val="left"/>
+      </w:pPr>
+      <w:r>
+        <w:rPr>
+          <w:rFonts w:ascii="Consolas" w:hAnsi="Consolas" w:cs="Courier New"/>
+          <w:sz w:val="18"/>
+          <w:szCs w:val="18"/>
+          <w:lang w:val="en-GB"/>
+        </w:rPr>
+        <w:t xml:space="preserve">                if (instance == null) {</w:t>
+      </w:r>
+    </w:p>
+    <w:p>
+      <w:pPr>
+        <w:keepNext/>
+        <w:keepLines/>
+        <w:pBdr>
+          <w:top w:val="single" w:sz="4" w:space="4" w:color="BFBFBF"/>
+          <w:left w:val="single" w:sz="4" w:space="4" w:color="BFBFBF"/>
+          <w:bottom w:val="single" w:sz="4" w:space="4" w:color="BFBFBF"/>
+          <w:right w:val="single" w:sz="4" w:space="4" w:color="BFBFBF"/>
+        </w:pBdr>
+        <w:shd w:val="clear" w:color="auto" w:fill="F5F5F5"/>
+        <w:spacing w:before="0" w:after="0" w:line="240" w:lineRule="auto"/>
+        <w:ind w:left="113" w:right="113"/>
+        <w:jc w:val="left"/>
+      </w:pPr>
+      <w:r>
+        <w:rPr>
+          <w:rFonts w:ascii="Consolas" w:hAnsi="Consolas" w:cs="Courier New"/>
+          <w:sz w:val="18"/>
+          <w:szCs w:val="18"/>
+          <w:lang w:val="en-GB"/>
+        </w:rPr>
+        <w:t xml:space="preserve">                    instance = new ReservationNumberGenerator();</w:t>
+      </w:r>
+    </w:p>
+    <w:p>
+      <w:pPr>
+        <w:keepNext/>
+        <w:keepLines/>
+        <w:pBdr>
+          <w:top w:val="single" w:sz="4" w:space="4" w:color="BFBFBF"/>
+          <w:left w:val="single" w:sz="4" w:space="4" w:color="BFBFBF"/>
+          <w:bottom w:val="single" w:sz="4" w:space="4" w:color="BFBFBF"/>
+          <w:right w:val="single" w:sz="4" w:space="4" w:color="BFBFBF"/>
+        </w:pBdr>
+        <w:shd w:val="clear" w:color="auto" w:fill="F5F5F5"/>
+        <w:spacing w:before="0" w:after="0" w:line="240" w:lineRule="auto"/>
+        <w:ind w:left="113" w:right="113"/>
+        <w:jc w:val="left"/>
+      </w:pPr>
+      <w:r>
+        <w:rPr>
+          <w:rFonts w:ascii="Consolas" w:hAnsi="Consolas" w:cs="Courier New"/>
+          <w:sz w:val="18"/>
+          <w:szCs w:val="18"/>
+          <w:lang w:val="en-GB"/>
+        </w:rPr>
+        <w:t xml:space="preserve">                }</w:t>
+      </w:r>
+    </w:p>
+    <w:p>
+      <w:pPr>
+        <w:keepNext/>
+        <w:keepLines/>
+        <w:pBdr>
+          <w:top w:val="single" w:sz="4" w:space="4" w:color="BFBFBF"/>
+          <w:left w:val="single" w:sz="4" w:space="4" w:color="BFBFBF"/>
+          <w:bottom w:val="single" w:sz="4" w:space="4" w:color="BFBFBF"/>
+          <w:right w:val="single" w:sz="4" w:space="4" w:color="BFBFBF"/>
+        </w:pBdr>
+        <w:shd w:val="clear" w:color="auto" w:fill="F5F5F5"/>
+        <w:spacing w:before="0" w:after="0" w:line="240" w:lineRule="auto"/>
+        <w:ind w:left="113" w:right="113"/>
+        <w:jc w:val="left"/>
+      </w:pPr>
+      <w:r>
+        <w:rPr>
+          <w:rFonts w:ascii="Consolas" w:hAnsi="Consolas" w:cs="Courier New"/>
+          <w:sz w:val="18"/>
+          <w:szCs w:val="18"/>
+          <w:lang w:val="en-GB"/>
+        </w:rPr>
+        <w:t xml:space="preserve">            }</w:t>
+      </w:r>
+    </w:p>
+    <w:p>
+      <w:pPr>
+        <w:keepNext/>
+        <w:keepLines/>
+        <w:pBdr>
+          <w:top w:val="single" w:sz="4" w:space="4" w:color="BFBFBF"/>
+          <w:left w:val="single" w:sz="4" w:space="4" w:color="BFBFBF"/>
+          <w:bottom w:val="single" w:sz="4" w:space="4" w:color="BFBFBF"/>
+          <w:right w:val="single" w:sz="4" w:space="4" w:color="BFBFBF"/>
+        </w:pBdr>
+        <w:shd w:val="clear" w:color="auto" w:fill="F5F5F5"/>
+        <w:spacing w:before="0" w:after="0" w:line="240" w:lineRule="auto"/>
+        <w:ind w:left="113" w:right="113"/>
+        <w:jc w:val="left"/>
+      </w:pPr>
+      <w:r>
+        <w:rPr>
+          <w:rFonts w:ascii="Consolas" w:hAnsi="Consolas" w:cs="Courier New"/>
+          <w:sz w:val="18"/>
+          <w:szCs w:val="18"/>
+          <w:lang w:val="en-GB"/>
+        </w:rPr>
+        <w:t xml:space="preserve">        }</w:t>
+      </w:r>
+    </w:p>
+    <w:p>
+      <w:pPr>
+        <w:keepNext/>
+        <w:keepLines/>
+        <w:pBdr>
+          <w:top w:val="single" w:sz="4" w:space="4" w:color="BFBFBF"/>
+          <w:left w:val="single" w:sz="4" w:space="4" w:color="BFBFBF"/>
+          <w:bottom w:val="single" w:sz="4" w:space="4" w:color="BFBFBF"/>
+          <w:right w:val="single" w:sz="4" w:space="4" w:color="BFBFBF"/>
+        </w:pBdr>
+        <w:shd w:val="clear" w:color="auto" w:fill="F5F5F5"/>
+        <w:spacing w:before="0" w:after="0" w:line="240" w:lineRule="auto"/>
+        <w:ind w:left="113" w:right="113"/>
+        <w:jc w:val="left"/>
+      </w:pPr>
+      <w:r>
+        <w:rPr>
+          <w:rFonts w:ascii="Consolas" w:hAnsi="Consolas" w:cs="Courier New"/>
+          <w:sz w:val="18"/>
+          <w:szCs w:val="18"/>
+          <w:lang w:val="en-GB"/>
+        </w:rPr>
+        <w:t xml:space="preserve">        return instance;</w:t>
+      </w:r>
+    </w:p>
+    <w:p>
+      <w:pPr>
+        <w:keepNext/>
+        <w:keepLines/>
+        <w:pBdr>
+          <w:top w:val="single" w:sz="4" w:space="4" w:color="BFBFBF"/>
+          <w:left w:val="single" w:sz="4" w:space="4" w:color="BFBFBF"/>
+          <w:bottom w:val="single" w:sz="4" w:space="4" w:color="BFBFBF"/>
+          <w:right w:val="single" w:sz="4" w:space="4" w:color="BFBFBF"/>
+        </w:pBdr>
+        <w:shd w:val="clear" w:color="auto" w:fill="F5F5F5"/>
+        <w:spacing w:before="0" w:after="0" w:line="240" w:lineRule="auto"/>
+        <w:ind w:left="113" w:right="113"/>
+        <w:jc w:val="left"/>
+      </w:pPr>
+      <w:r>
+        <w:rPr>
+          <w:rFonts w:ascii="Consolas" w:hAnsi="Consolas" w:cs="Courier New"/>
+          <w:sz w:val="18"/>
+          <w:szCs w:val="18"/>
+          <w:lang w:val="en-GB"/>
+        </w:rPr>
+        <w:t xml:space="preserve">    }</w:t>
+      </w:r>
+    </w:p>
+    <w:p>
+      <w:pPr>
+        <w:keepNext/>
+        <w:keepLines/>
+        <w:pBdr>
+          <w:top w:val="single" w:sz="4" w:space="4" w:color="BFBFBF"/>
+          <w:left w:val="single" w:sz="4" w:space="4" w:color="BFBFBF"/>
+          <w:bottom w:val="single" w:sz="4" w:space="4" w:color="BFBFBF"/>
+          <w:right w:val="single" w:sz="4" w:space="4" w:color="BFBFBF"/>
+        </w:pBdr>
+        <w:shd w:val="clear" w:color="auto" w:fill="F5F5F5"/>
+        <w:spacing w:before="0" w:after="0" w:line="240" w:lineRule="auto"/>
+        <w:ind w:left="113" w:right="113"/>
+        <w:jc w:val="left"/>
+      </w:pPr>
+      <w:r>
+        <w:rPr>
+          <w:rFonts w:ascii="Consolas" w:hAnsi="Consolas" w:cs="Courier New"/>
+          <w:sz w:val="18"/>
+          <w:szCs w:val="18"/>
+          <w:lang w:val="en-GB"/>
+        </w:rPr>
+        <w:t xml:space="preserve"> </w:t>
+      </w:r>
+    </w:p>
+    <w:p>
+      <w:pPr>
+        <w:keepNext/>
+        <w:keepLines/>
+        <w:pBdr>
+          <w:top w:val="single" w:sz="4" w:space="4" w:color="BFBFBF"/>
+          <w:left w:val="single" w:sz="4" w:space="4" w:color="BFBFBF"/>
+          <w:bottom w:val="single" w:sz="4" w:space="4" w:color="BFBFBF"/>
+          <w:right w:val="single" w:sz="4" w:space="4" w:color="BFBFBF"/>
+        </w:pBdr>
+        <w:shd w:val="clear" w:color="auto" w:fill="F5F5F5"/>
+        <w:spacing w:before="0" w:after="0" w:line="240" w:lineRule="auto"/>
+        <w:ind w:left="113" w:right="113"/>
+        <w:jc w:val="left"/>
+      </w:pPr>
+      <w:r>
+        <w:rPr>
+          <w:rFonts w:ascii="Consolas" w:hAnsi="Consolas" w:cs="Courier New"/>
+          <w:sz w:val="18"/>
+          <w:szCs w:val="18"/>
+          <w:lang w:val="en-GB"/>
+        </w:rPr>
+        <w:t xml:space="preserve">    // synchronized: two desks booking at the same moment never get the same code</w:t>
+      </w:r>
+    </w:p>
+    <w:p>
+      <w:pPr>
+        <w:keepNext/>
+        <w:keepLines/>
+        <w:pBdr>
+          <w:top w:val="single" w:sz="4" w:space="4" w:color="BFBFBF"/>
+          <w:left w:val="single" w:sz="4" w:space="4" w:color="BFBFBF"/>
+          <w:bottom w:val="single" w:sz="4" w:space="4" w:color="BFBFBF"/>
+          <w:right w:val="single" w:sz="4" w:space="4" w:color="BFBFBF"/>
+        </w:pBdr>
+        <w:shd w:val="clear" w:color="auto" w:fill="F5F5F5"/>
+        <w:spacing w:before="0" w:after="0" w:line="240" w:lineRule="auto"/>
+        <w:ind w:left="113" w:right="113"/>
+        <w:jc w:val="left"/>
+      </w:pPr>
+      <w:r>
+        <w:rPr>
+          <w:rFonts w:ascii="Consolas" w:hAnsi="Consolas" w:cs="Courier New"/>
+          <w:sz w:val="18"/>
+          <w:szCs w:val="18"/>
+          <w:lang w:val="en-GB"/>
+        </w:rPr>
+        <w:t xml:space="preserve">    public synchronized String next() {</w:t>
+      </w:r>
+    </w:p>
+    <w:p>
+      <w:pPr>
+        <w:keepNext/>
+        <w:keepLines/>
+        <w:pBdr>
+          <w:top w:val="single" w:sz="4" w:space="4" w:color="BFBFBF"/>
+          <w:left w:val="single" w:sz="4" w:space="4" w:color="BFBFBF"/>
+          <w:bottom w:val="single" w:sz="4" w:space="4" w:color="BFBFBF"/>
+          <w:right w:val="single" w:sz="4" w:space="4" w:color="BFBFBF"/>
+        </w:pBdr>
+        <w:shd w:val="clear" w:color="auto" w:fill="F5F5F5"/>
+        <w:spacing w:before="0" w:after="0" w:line="240" w:lineRule="auto"/>
+        <w:ind w:left="113" w:right="113"/>
+        <w:jc w:val="left"/>
+      </w:pPr>
+      <w:r>
+        <w:rPr>
+          <w:rFonts w:ascii="Consolas" w:hAnsi="Consolas" w:cs="Courier New"/>
+          <w:sz w:val="18"/>
+          <w:szCs w:val="18"/>
+          <w:lang w:val="en-GB"/>
+        </w:rPr>
+        <w:t xml:space="preserve">        lastNumber++;</w:t>
+      </w:r>
+    </w:p>
+    <w:p>
+      <w:pPr>
+        <w:keepNext/>
+        <w:keepLines/>
+        <w:pBdr>
+          <w:top w:val="single" w:sz="4" w:space="4" w:color="BFBFBF"/>
+          <w:left w:val="single" w:sz="4" w:space="4" w:color="BFBFBF"/>
+          <w:bottom w:val="single" w:sz="4" w:space="4" w:color="BFBFBF"/>
+          <w:right w:val="single" w:sz="4" w:space="4" w:color="BFBFBF"/>
+        </w:pBdr>
+        <w:shd w:val="clear" w:color="auto" w:fill="F5F5F5"/>
+        <w:spacing w:before="0" w:after="0" w:line="240" w:lineRule="auto"/>
+        <w:ind w:left="113" w:right="113"/>
+        <w:jc w:val="left"/>
+      </w:pPr>
+      <w:r>
+        <w:rPr>
+          <w:rFonts w:ascii="Consolas" w:hAnsi="Consolas" w:cs="Courier New"/>
+          <w:sz w:val="18"/>
+          <w:szCs w:val="18"/>
+          <w:lang w:val="en-GB"/>
+        </w:rPr>
+        <w:t xml:space="preserve">        return String.format("RES-%04d", lastNumber);</w:t>
+      </w:r>
+    </w:p>
+    <w:p>
+      <w:pPr>
+        <w:keepNext/>
+        <w:keepLines/>
+        <w:pBdr>
+          <w:top w:val="single" w:sz="4" w:space="4" w:color="BFBFBF"/>
+          <w:left w:val="single" w:sz="4" w:space="4" w:color="BFBFBF"/>
+          <w:bottom w:val="single" w:sz="4" w:space="4" w:color="BFBFBF"/>
+          <w:right w:val="single" w:sz="4" w:space="4" w:color="BFBFBF"/>
+        </w:pBdr>
+        <w:shd w:val="clear" w:color="auto" w:fill="F5F5F5"/>
+        <w:spacing w:before="0" w:after="0" w:line="240" w:lineRule="auto"/>
+        <w:ind w:left="113" w:right="113"/>
+        <w:jc w:val="left"/>
+      </w:pPr>
+      <w:r>
+        <w:rPr>
+          <w:rFonts w:ascii="Consolas" w:hAnsi="Consolas" w:cs="Courier New"/>
+          <w:sz w:val="18"/>
+          <w:szCs w:val="18"/>
+          <w:lang w:val="en-GB"/>
+        </w:rPr>
+        <w:t xml:space="preserve">    }</w:t>
+      </w:r>
+    </w:p>
+    <w:p>
+      <w:pPr>
+        <w:keepLines/>
+        <w:pBdr>
+          <w:top w:val="single" w:sz="4" w:space="4" w:color="BFBFBF"/>
+          <w:left w:val="single" w:sz="4" w:space="4" w:color="BFBFBF"/>
+          <w:bottom w:val="single" w:sz="4" w:space="4" w:color="BFBFBF"/>
+          <w:right w:val="single" w:sz="4" w:space="4" w:color="BFBFBF"/>
+        </w:pBdr>
+        <w:shd w:val="clear" w:color="auto" w:fill="F5F5F5"/>
+        <w:spacing w:before="0" w:after="200" w:line="240" w:lineRule="auto"/>
+        <w:ind w:left="113" w:right="113"/>
+        <w:jc w:val="left"/>
+      </w:pPr>
+      <w:r>
+        <w:rPr>
+          <w:rFonts w:ascii="Consolas" w:hAnsi="Consolas" w:cs="Courier New"/>
+          <w:sz w:val="18"/>
+          <w:szCs w:val="18"/>
+          <w:lang w:val="en-GB"/>
+        </w:rPr>
+        <w:t xml:space="preserve">}</w:t>
+      </w:r>
+    </w:p>
+    <w:p>
+      <w:pPr>
+        <w:pStyle w:val="NoSpacing"/>
+        <w:keepNext/>
+        <w:spacing w:after="120"/>
+      </w:pPr>
+      <w:r>
+        <w:rPr>
+          <w:rFonts w:ascii="Consolas" w:hAnsi="Consolas" w:cs="Courier New"/>
+          <w:sz w:val="22"/>
+          <w:szCs w:val="22"/>
+          <w:shd w:val="clear" w:color="auto" w:fill="F2F2F2"/>
+          <w:lang w:val="en-GB"/>
+        </w:rPr>
+        <w:t xml:space="preserve">BookingSystem</w:t>
+      </w:r>
+      <w:r>
+        <w:rPr>
+          <w:lang w:val="en-GB"/>
+        </w:rPr>
+        <w:t xml:space="preserve">, which stores the rooms and reservations, is deliberately </w:t>
+      </w:r>
+      <w:r>
+        <w:rPr>
+          <w:b/>
+          <w:bCs/>
+          <w:lang w:val="en-GB"/>
+        </w:rPr>
+        <w:t xml:space="preserve">not</w:t>
+      </w:r>
+      <w:r>
+        <w:rPr>
+          <w:lang w:val="en-GB"/>
+        </w:rPr>
+        <w:t xml:space="preserve"> a Singleton. It works like an in-memory database, and a database should be injected rather than accessed globally (see section 2.2). The client creates one </w:t>
+      </w:r>
+      <w:r>
+        <w:rPr>
+          <w:rFonts w:ascii="Consolas" w:hAnsi="Consolas" w:cs="Courier New"/>
+          <w:sz w:val="22"/>
+          <w:szCs w:val="22"/>
+          <w:shd w:val="clear" w:color="auto" w:fill="F2F2F2"/>
+          <w:lang w:val="en-GB"/>
+        </w:rPr>
+        <w:t xml:space="preserve">BookingSystem</w:t>
+      </w:r>
+      <w:r>
+        <w:rPr>
+          <w:lang w:val="en-GB"/>
+        </w:rPr>
+        <w:t xml:space="preserve"> and passes it to the factories and to the booking code. The generator is also passed to </w:t>
+      </w:r>
+      <w:r>
+        <w:rPr>
+          <w:rFonts w:ascii="Consolas" w:hAnsi="Consolas" w:cs="Courier New"/>
+          <w:sz w:val="22"/>
+          <w:szCs w:val="22"/>
+          <w:shd w:val="clear" w:color="auto" w:fill="F2F2F2"/>
+          <w:lang w:val="en-GB"/>
+        </w:rPr>
+        <w:t xml:space="preserve">BookingSystem</w:t>
+      </w:r>
+      <w:r>
+        <w:rPr>
+          <w:lang w:val="en-GB"/>
+        </w:rPr>
+        <w:t xml:space="preserve"> through its constructor, so the dependency is visible instead of hidden behind a </w:t>
+      </w:r>
+      <w:r>
+        <w:rPr>
+          <w:rFonts w:ascii="Consolas" w:hAnsi="Consolas" w:cs="Courier New"/>
+          <w:sz w:val="22"/>
+          <w:szCs w:val="22"/>
+          <w:shd w:val="clear" w:color="auto" w:fill="F2F2F2"/>
+          <w:lang w:val="en-GB"/>
+        </w:rPr>
         <w:t xml:space="preserve">getInstance()</w:t>
       </w:r>
       <w:r>
         <w:rPr>
           <w:lang w:val="en-GB"/>
         </w:rPr>
+        <w:t xml:space="preserve"> call inside the class:</w:t>
+      </w:r>
+    </w:p>
+    <w:p>
+      <w:pPr>
+        <w:keepNext/>
+        <w:keepLines/>
+        <w:pBdr>
+          <w:top w:val="single" w:sz="4" w:space="4" w:color="BFBFBF"/>
+          <w:left w:val="single" w:sz="4" w:space="4" w:color="BFBFBF"/>
+          <w:bottom w:val="single" w:sz="4" w:space="4" w:color="BFBFBF"/>
+          <w:right w:val="single" w:sz="4" w:space="4" w:color="BFBFBF"/>
+        </w:pBdr>
+        <w:shd w:val="clear" w:color="auto" w:fill="F5F5F5"/>
+        <w:spacing w:before="120" w:after="0" w:line="240" w:lineRule="auto"/>
+        <w:ind w:left="113" w:right="113"/>
+        <w:jc w:val="left"/>
+      </w:pPr>
+      <w:r>
+        <w:rPr>
+          <w:rFonts w:ascii="Consolas" w:hAnsi="Consolas" w:cs="Courier New"/>
+          <w:sz w:val="18"/>
+          <w:szCs w:val="18"/>
+          <w:lang w:val="en-GB"/>
+        </w:rPr>
+        <w:t xml:space="preserve">// the generator is injected, so the dependency is visible in the constructor</w:t>
+      </w:r>
+    </w:p>
+    <w:p>
+      <w:pPr>
+        <w:keepNext/>
+        <w:keepLines/>
+        <w:pBdr>
+          <w:top w:val="single" w:sz="4" w:space="4" w:color="BFBFBF"/>
+          <w:left w:val="single" w:sz="4" w:space="4" w:color="BFBFBF"/>
+          <w:bottom w:val="single" w:sz="4" w:space="4" w:color="BFBFBF"/>
+          <w:right w:val="single" w:sz="4" w:space="4" w:color="BFBFBF"/>
+        </w:pBdr>
+        <w:shd w:val="clear" w:color="auto" w:fill="F5F5F5"/>
+        <w:spacing w:before="0" w:after="0" w:line="240" w:lineRule="auto"/>
+        <w:ind w:left="113" w:right="113"/>
+        <w:jc w:val="left"/>
+      </w:pPr>
+      <w:r>
+        <w:rPr>
+          <w:rFonts w:ascii="Consolas" w:hAnsi="Consolas" w:cs="Courier New"/>
+          <w:sz w:val="18"/>
+          <w:szCs w:val="18"/>
+          <w:lang w:val="en-GB"/>
+        </w:rPr>
+        <w:t xml:space="preserve">public BookingSystem(ReservationNumberGenerator numberGenerator) {</w:t>
+      </w:r>
+    </w:p>
+    <w:p>
+      <w:pPr>
+        <w:keepNext/>
+        <w:keepLines/>
+        <w:pBdr>
+          <w:top w:val="single" w:sz="4" w:space="4" w:color="BFBFBF"/>
+          <w:left w:val="single" w:sz="4" w:space="4" w:color="BFBFBF"/>
+          <w:bottom w:val="single" w:sz="4" w:space="4" w:color="BFBFBF"/>
+          <w:right w:val="single" w:sz="4" w:space="4" w:color="BFBFBF"/>
+        </w:pBdr>
+        <w:shd w:val="clear" w:color="auto" w:fill="F5F5F5"/>
+        <w:spacing w:before="0" w:after="0" w:line="240" w:lineRule="auto"/>
+        <w:ind w:left="113" w:right="113"/>
+        <w:jc w:val="left"/>
+      </w:pPr>
+      <w:r>
+        <w:rPr>
+          <w:rFonts w:ascii="Consolas" w:hAnsi="Consolas" w:cs="Courier New"/>
+          <w:sz w:val="18"/>
+          <w:szCs w:val="18"/>
+          <w:lang w:val="en-GB"/>
+        </w:rPr>
+        <w:t xml:space="preserve">    this.numberGenerator = numberGenerator;</w:t>
+      </w:r>
+    </w:p>
+    <w:p>
+      <w:pPr>
+        <w:keepLines/>
+        <w:pBdr>
+          <w:top w:val="single" w:sz="4" w:space="4" w:color="BFBFBF"/>
+          <w:left w:val="single" w:sz="4" w:space="4" w:color="BFBFBF"/>
+          <w:bottom w:val="single" w:sz="4" w:space="4" w:color="BFBFBF"/>
+          <w:right w:val="single" w:sz="4" w:space="4" w:color="BFBFBF"/>
+        </w:pBdr>
+        <w:shd w:val="clear" w:color="auto" w:fill="F5F5F5"/>
+        <w:spacing w:before="0" w:after="200" w:line="240" w:lineRule="auto"/>
+        <w:ind w:left="113" w:right="113"/>
+        <w:jc w:val="left"/>
+      </w:pPr>
+      <w:r>
+        <w:rPr>
+          <w:rFonts w:ascii="Consolas" w:hAnsi="Consolas" w:cs="Courier New"/>
+          <w:sz w:val="18"/>
+          <w:szCs w:val="18"/>
+          <w:lang w:val="en-GB"/>
+        </w:rPr>
+        <w:t xml:space="preserve">}</w:t>
+      </w:r>
+    </w:p>
+    <w:p>
+      <w:pPr>
+        <w:keepNext/>
+        <w:keepLines/>
+        <w:pBdr>
+          <w:top w:val="single" w:sz="4" w:space="4" w:color="BFBFBF"/>
+          <w:left w:val="single" w:sz="4" w:space="4" w:color="BFBFBF"/>
+          <w:bottom w:val="single" w:sz="4" w:space="4" w:color="BFBFBF"/>
+          <w:right w:val="single" w:sz="4" w:space="4" w:color="BFBFBF"/>
+        </w:pBdr>
+        <w:shd w:val="clear" w:color="auto" w:fill="F5F5F5"/>
+        <w:spacing w:before="120" w:after="0" w:line="240" w:lineRule="auto"/>
+        <w:ind w:left="113" w:right="113"/>
+        <w:jc w:val="left"/>
+      </w:pPr>
+      <w:r>
+        <w:rPr>
+          <w:rFonts w:ascii="Consolas" w:hAnsi="Consolas" w:cs="Courier New"/>
+          <w:sz w:val="18"/>
+          <w:szCs w:val="18"/>
+          <w:lang w:val="en-GB"/>
+        </w:rPr>
+        <w:t xml:space="preserve">// returns the confirmation code, or empty if the room is already taken for those dates</w:t>
+      </w:r>
+    </w:p>
+    <w:p>
+      <w:pPr>
+        <w:keepNext/>
+        <w:keepLines/>
+        <w:pBdr>
+          <w:top w:val="single" w:sz="4" w:space="4" w:color="BFBFBF"/>
+          <w:left w:val="single" w:sz="4" w:space="4" w:color="BFBFBF"/>
+          <w:bottom w:val="single" w:sz="4" w:space="4" w:color="BFBFBF"/>
+          <w:right w:val="single" w:sz="4" w:space="4" w:color="BFBFBF"/>
+        </w:pBdr>
+        <w:shd w:val="clear" w:color="auto" w:fill="F5F5F5"/>
+        <w:spacing w:before="0" w:after="0" w:line="240" w:lineRule="auto"/>
+        <w:ind w:left="113" w:right="113"/>
+        <w:jc w:val="left"/>
+      </w:pPr>
+      <w:r>
+        <w:rPr>
+          <w:rFonts w:ascii="Consolas" w:hAnsi="Consolas" w:cs="Courier New"/>
+          <w:sz w:val="18"/>
+          <w:szCs w:val="18"/>
+          <w:lang w:val="en-GB"/>
+        </w:rPr>
+        <w:t xml:space="preserve">public synchronized Optional&lt;String&gt; book(Reservation reservation) {</w:t>
+      </w:r>
+    </w:p>
+    <w:p>
+      <w:pPr>
+        <w:keepNext/>
+        <w:keepLines/>
+        <w:pBdr>
+          <w:top w:val="single" w:sz="4" w:space="4" w:color="BFBFBF"/>
+          <w:left w:val="single" w:sz="4" w:space="4" w:color="BFBFBF"/>
+          <w:bottom w:val="single" w:sz="4" w:space="4" w:color="BFBFBF"/>
+          <w:right w:val="single" w:sz="4" w:space="4" w:color="BFBFBF"/>
+        </w:pBdr>
+        <w:shd w:val="clear" w:color="auto" w:fill="F5F5F5"/>
+        <w:spacing w:before="0" w:after="0" w:line="240" w:lineRule="auto"/>
+        <w:ind w:left="113" w:right="113"/>
+        <w:jc w:val="left"/>
+      </w:pPr>
+      <w:r>
+        <w:rPr>
+          <w:rFonts w:ascii="Consolas" w:hAnsi="Consolas" w:cs="Courier New"/>
+          <w:sz w:val="18"/>
+          <w:szCs w:val="18"/>
+          <w:lang w:val="en-GB"/>
+        </w:rPr>
+        <w:t xml:space="preserve">    if (!isAvailable(reservation.getRoom(), reservation.getCheckIn(), reservation.getCheckOut())) {</w:t>
+      </w:r>
+    </w:p>
+    <w:p>
+      <w:pPr>
+        <w:keepNext/>
+        <w:keepLines/>
+        <w:pBdr>
+          <w:top w:val="single" w:sz="4" w:space="4" w:color="BFBFBF"/>
+          <w:left w:val="single" w:sz="4" w:space="4" w:color="BFBFBF"/>
+          <w:bottom w:val="single" w:sz="4" w:space="4" w:color="BFBFBF"/>
+          <w:right w:val="single" w:sz="4" w:space="4" w:color="BFBFBF"/>
+        </w:pBdr>
+        <w:shd w:val="clear" w:color="auto" w:fill="F5F5F5"/>
+        <w:spacing w:before="0" w:after="0" w:line="240" w:lineRule="auto"/>
+        <w:ind w:left="113" w:right="113"/>
+        <w:jc w:val="left"/>
+      </w:pPr>
+      <w:r>
+        <w:rPr>
+          <w:rFonts w:ascii="Consolas" w:hAnsi="Consolas" w:cs="Courier New"/>
+          <w:sz w:val="18"/>
+          <w:szCs w:val="18"/>
+          <w:lang w:val="en-GB"/>
+        </w:rPr>
+        <w:t xml:space="preserve">        return Optional.empty();</w:t>
+      </w:r>
+    </w:p>
+    <w:p>
+      <w:pPr>
+        <w:keepNext/>
+        <w:keepLines/>
+        <w:pBdr>
+          <w:top w:val="single" w:sz="4" w:space="4" w:color="BFBFBF"/>
+          <w:left w:val="single" w:sz="4" w:space="4" w:color="BFBFBF"/>
+          <w:bottom w:val="single" w:sz="4" w:space="4" w:color="BFBFBF"/>
+          <w:right w:val="single" w:sz="4" w:space="4" w:color="BFBFBF"/>
+        </w:pBdr>
+        <w:shd w:val="clear" w:color="auto" w:fill="F5F5F5"/>
+        <w:spacing w:before="0" w:after="0" w:line="240" w:lineRule="auto"/>
+        <w:ind w:left="113" w:right="113"/>
+        <w:jc w:val="left"/>
+      </w:pPr>
+      <w:r>
+        <w:rPr>
+          <w:rFonts w:ascii="Consolas" w:hAnsi="Consolas" w:cs="Courier New"/>
+          <w:sz w:val="18"/>
+          <w:szCs w:val="18"/>
+          <w:lang w:val="en-GB"/>
+        </w:rPr>
+        <w:t xml:space="preserve">    }</w:t>
+      </w:r>
+    </w:p>
+    <w:p>
+      <w:pPr>
+        <w:keepNext/>
+        <w:keepLines/>
+        <w:pBdr>
+          <w:top w:val="single" w:sz="4" w:space="4" w:color="BFBFBF"/>
+          <w:left w:val="single" w:sz="4" w:space="4" w:color="BFBFBF"/>
+          <w:bottom w:val="single" w:sz="4" w:space="4" w:color="BFBFBF"/>
+          <w:right w:val="single" w:sz="4" w:space="4" w:color="BFBFBF"/>
+        </w:pBdr>
+        <w:shd w:val="clear" w:color="auto" w:fill="F5F5F5"/>
+        <w:spacing w:before="0" w:after="0" w:line="240" w:lineRule="auto"/>
+        <w:ind w:left="113" w:right="113"/>
+        <w:jc w:val="left"/>
+      </w:pPr>
+      <w:r>
+        <w:rPr>
+          <w:rFonts w:ascii="Consolas" w:hAnsi="Consolas" w:cs="Courier New"/>
+          <w:sz w:val="18"/>
+          <w:szCs w:val="18"/>
+          <w:lang w:val="en-GB"/>
+        </w:rPr>
+        <w:t xml:space="preserve">    String code = numberGenerator.next();</w:t>
+      </w:r>
+    </w:p>
+    <w:p>
+      <w:pPr>
+        <w:keepNext/>
+        <w:keepLines/>
+        <w:pBdr>
+          <w:top w:val="single" w:sz="4" w:space="4" w:color="BFBFBF"/>
+          <w:left w:val="single" w:sz="4" w:space="4" w:color="BFBFBF"/>
+          <w:bottom w:val="single" w:sz="4" w:space="4" w:color="BFBFBF"/>
+          <w:right w:val="single" w:sz="4" w:space="4" w:color="BFBFBF"/>
+        </w:pBdr>
+        <w:shd w:val="clear" w:color="auto" w:fill="F5F5F5"/>
+        <w:spacing w:before="0" w:after="0" w:line="240" w:lineRule="auto"/>
+        <w:ind w:left="113" w:right="113"/>
+        <w:jc w:val="left"/>
+      </w:pPr>
+      <w:r>
+        <w:rPr>
+          <w:rFonts w:ascii="Consolas" w:hAnsi="Consolas" w:cs="Courier New"/>
+          <w:sz w:val="18"/>
+          <w:szCs w:val="18"/>
+          <w:lang w:val="en-GB"/>
+        </w:rPr>
+        <w:t xml:space="preserve">    reservations.put(code, reservation);</w:t>
+      </w:r>
+    </w:p>
+    <w:p>
+      <w:pPr>
+        <w:keepNext/>
+        <w:keepLines/>
+        <w:pBdr>
+          <w:top w:val="single" w:sz="4" w:space="4" w:color="BFBFBF"/>
+          <w:left w:val="single" w:sz="4" w:space="4" w:color="BFBFBF"/>
+          <w:bottom w:val="single" w:sz="4" w:space="4" w:color="BFBFBF"/>
+          <w:right w:val="single" w:sz="4" w:space="4" w:color="BFBFBF"/>
+        </w:pBdr>
+        <w:shd w:val="clear" w:color="auto" w:fill="F5F5F5"/>
+        <w:spacing w:before="0" w:after="0" w:line="240" w:lineRule="auto"/>
+        <w:ind w:left="113" w:right="113"/>
+        <w:jc w:val="left"/>
+      </w:pPr>
+      <w:r>
+        <w:rPr>
+          <w:rFonts w:ascii="Consolas" w:hAnsi="Consolas" w:cs="Courier New"/>
+          <w:sz w:val="18"/>
+          <w:szCs w:val="18"/>
+          <w:lang w:val="en-GB"/>
+        </w:rPr>
+        <w:t xml:space="preserve">    return Optional.of(code);</w:t>
+      </w:r>
+    </w:p>
+    <w:p>
+      <w:pPr>
+        <w:keepLines/>
+        <w:pBdr>
+          <w:top w:val="single" w:sz="4" w:space="4" w:color="BFBFBF"/>
+          <w:left w:val="single" w:sz="4" w:space="4" w:color="BFBFBF"/>
+          <w:bottom w:val="single" w:sz="4" w:space="4" w:color="BFBFBF"/>
+          <w:right w:val="single" w:sz="4" w:space="4" w:color="BFBFBF"/>
+        </w:pBdr>
+        <w:shd w:val="clear" w:color="auto" w:fill="F5F5F5"/>
+        <w:spacing w:before="0" w:after="200" w:line="240" w:lineRule="auto"/>
+        <w:ind w:left="113" w:right="113"/>
+        <w:jc w:val="left"/>
+      </w:pPr>
+      <w:r>
+        <w:rPr>
+          <w:rFonts w:ascii="Consolas" w:hAnsi="Consolas" w:cs="Courier New"/>
+          <w:sz w:val="18"/>
+          <w:szCs w:val="18"/>
+          <w:lang w:val="en-GB"/>
+        </w:rPr>
+        <w:t xml:space="preserve">}</w:t>
+      </w:r>
+    </w:p>
+    <w:p>
+      <w:pPr>
+        <w:keepNext/>
+        <w:keepLines/>
+        <w:pBdr>
+          <w:top w:val="single" w:sz="4" w:space="4" w:color="BFBFBF"/>
+          <w:left w:val="single" w:sz="4" w:space="4" w:color="BFBFBF"/>
+          <w:bottom w:val="single" w:sz="4" w:space="4" w:color="BFBFBF"/>
+          <w:right w:val="single" w:sz="4" w:space="4" w:color="BFBFBF"/>
+        </w:pBdr>
+        <w:shd w:val="clear" w:color="auto" w:fill="F5F5F5"/>
+        <w:spacing w:before="120" w:after="0" w:line="240" w:lineRule="auto"/>
+        <w:ind w:left="113" w:right="113"/>
+        <w:jc w:val="left"/>
+      </w:pPr>
+      <w:r>
+        <w:rPr>
+          <w:rFonts w:ascii="Consolas" w:hAnsi="Consolas" w:cs="Courier New"/>
+          <w:sz w:val="18"/>
+          <w:szCs w:val="18"/>
+          <w:lang w:val="en-GB"/>
+        </w:rPr>
+        <w:t xml:space="preserve">// one booking system for the whole program, passed to everyone who needs it</w:t>
+      </w:r>
+    </w:p>
+    <w:p>
+      <w:pPr>
+        <w:keepLines/>
+        <w:pBdr>
+          <w:top w:val="single" w:sz="4" w:space="4" w:color="BFBFBF"/>
+          <w:left w:val="single" w:sz="4" w:space="4" w:color="BFBFBF"/>
+          <w:bottom w:val="single" w:sz="4" w:space="4" w:color="BFBFBF"/>
+          <w:right w:val="single" w:sz="4" w:space="4" w:color="BFBFBF"/>
+        </w:pBdr>
+        <w:shd w:val="clear" w:color="auto" w:fill="F5F5F5"/>
+        <w:spacing w:before="0" w:after="200" w:line="240" w:lineRule="auto"/>
+        <w:ind w:left="113" w:right="113"/>
+        <w:jc w:val="left"/>
+      </w:pPr>
+      <w:r>
+        <w:rPr>
+          <w:rFonts w:ascii="Consolas" w:hAnsi="Consolas" w:cs="Courier New"/>
+          <w:sz w:val="18"/>
+          <w:szCs w:val="18"/>
+          <w:lang w:val="en-GB"/>
+        </w:rPr>
+        <w:t xml:space="preserve">BookingSystem bookingSystem = new BookingSystem(ReservationNumberGenerator.getInstance());</w:t>
+      </w:r>
+    </w:p>
+    <w:p>
+      <w:pPr>
+        <w:pStyle w:val="NoSpacing"/>
+        <w:keepNext/>
+        <w:spacing w:after="120"/>
+      </w:pPr>
+      <w:r>
+        <w:rPr>
+          <w:lang w:val="en-GB"/>
+        </w:rPr>
+        <w:t xml:space="preserve">The client checks thread safety by starting 5 threads ("reception desks") that call </w:t>
+      </w:r>
+      <w:r>
+        <w:rPr>
+          <w:rFonts w:ascii="Consolas" w:hAnsi="Consolas" w:cs="Courier New"/>
+          <w:sz w:val="22"/>
+          <w:szCs w:val="22"/>
+          <w:shd w:val="clear" w:color="auto" w:fill="F2F2F2"/>
+          <w:lang w:val="en-GB"/>
+        </w:rPr>
+        <w:t xml:space="preserve">getInstance()</w:t>
+      </w:r>
+      <w:r>
+        <w:rPr>
+          <w:lang w:val="en-GB"/>
+        </w:rPr>
         <w:t xml:space="preserve"> at the same time and collecting the objects they receive:</w:t>
       </w:r>
     </w:p>
@@ -4893,32 +5410,32 @@
           <w:szCs w:val="18"/>
           <w:lang w:val="en-GB"/>
         </w:rPr>
-        <w:t xml:space="preserve">// 5 reception desks ask for the booking system at the same time</w:t>
-      </w:r>
-    </w:p>
-    <w:p>
-      <w:pPr>
-        <w:keepNext/>
-        <w:keepLines/>
-        <w:pBdr>
-          <w:top w:val="single" w:sz="4" w:space="4" w:color="BFBFBF"/>
-          <w:left w:val="single" w:sz="4" w:space="4" w:color="BFBFBF"/>
-          <w:bottom w:val="single" w:sz="4" w:space="4" w:color="BFBFBF"/>
-          <w:right w:val="single" w:sz="4" w:space="4" w:color="BFBFBF"/>
-        </w:pBdr>
-        <w:shd w:val="clear" w:color="auto" w:fill="F5F5F5"/>
-        <w:spacing w:before="0" w:after="0" w:line="240" w:lineRule="auto"/>
-        <w:ind w:left="113" w:right="113"/>
-        <w:jc w:val="left"/>
-      </w:pPr>
-      <w:r>
-        <w:rPr>
-          <w:rFonts w:ascii="Consolas" w:hAnsi="Consolas" w:cs="Courier New"/>
-          <w:sz w:val="18"/>
-          <w:szCs w:val="18"/>
-          <w:lang w:val="en-GB"/>
-        </w:rPr>
-        <w:t xml:space="preserve">Set&lt;BookingSystem&gt; seen = ConcurrentHashMap.newKeySet();</w:t>
+        <w:t xml:space="preserve">// 5 reception desks ask for the generator at the same time</w:t>
+      </w:r>
+    </w:p>
+    <w:p>
+      <w:pPr>
+        <w:keepNext/>
+        <w:keepLines/>
+        <w:pBdr>
+          <w:top w:val="single" w:sz="4" w:space="4" w:color="BFBFBF"/>
+          <w:left w:val="single" w:sz="4" w:space="4" w:color="BFBFBF"/>
+          <w:bottom w:val="single" w:sz="4" w:space="4" w:color="BFBFBF"/>
+          <w:right w:val="single" w:sz="4" w:space="4" w:color="BFBFBF"/>
+        </w:pBdr>
+        <w:shd w:val="clear" w:color="auto" w:fill="F5F5F5"/>
+        <w:spacing w:before="0" w:after="0" w:line="240" w:lineRule="auto"/>
+        <w:ind w:left="113" w:right="113"/>
+        <w:jc w:val="left"/>
+      </w:pPr>
+      <w:r>
+        <w:rPr>
+          <w:rFonts w:ascii="Consolas" w:hAnsi="Consolas" w:cs="Courier New"/>
+          <w:sz w:val="18"/>
+          <w:szCs w:val="18"/>
+          <w:lang w:val="en-GB"/>
+        </w:rPr>
+        <w:t xml:space="preserve">Set&lt;ReservationNumberGenerator&gt; seen = ConcurrentHashMap.newKeySet();</w:t>
       </w:r>
     </w:p>
     <w:p>
@@ -4993,7 +5510,7 @@
           <w:szCs w:val="18"/>
           <w:lang w:val="en-GB"/>
         </w:rPr>
-        <w:t xml:space="preserve">    desks.add(new Thread(() -&gt; seen.add(BookingSystem.getInstance())));</w:t>
+        <w:t xml:space="preserve">    desks.add(new Thread(() -&gt; seen.add(ReservationNumberGenerator.getInstance())));</w:t>
       </w:r>
     </w:p>
     <w:p>
@@ -5167,7 +5684,7 @@
         <w:rPr>
           <w:lang w:val="en-GB"/>
         </w:rPr>
-        <w:t xml:space="preserve">, which creates a room and registers it in the booking system. </w:t>
+        <w:t xml:space="preserve">, which creates a room and registers it in the booking system it receives as a parameter. </w:t>
       </w:r>
       <w:r>
         <w:rPr>
@@ -5349,7 +5866,7 @@
           <w:szCs w:val="18"/>
           <w:lang w:val="en-GB"/>
         </w:rPr>
-        <w:t xml:space="preserve">    public Room openRoom(int number) {</w:t>
+        <w:t xml:space="preserve">    public Room openRoom(int number, BookingSystem bookingSystem) {</w:t>
       </w:r>
     </w:p>
     <w:p>
@@ -5399,7 +5916,7 @@
           <w:szCs w:val="18"/>
           <w:lang w:val="en-GB"/>
         </w:rPr>
-        <w:t xml:space="preserve">        BookingSystem.getInstance().addRoom(room);</w:t>
+        <w:t xml:space="preserve">        bookingSystem.addRoom(room);</w:t>
       </w:r>
     </w:p>
     <w:p>
@@ -5903,82 +6420,82 @@
           <w:szCs w:val="18"/>
           <w:lang w:val="en-GB"/>
         </w:rPr>
-        <w:t xml:space="preserve">factories.get(RoomType.SINGLE).openRoom(101);</w:t>
-      </w:r>
-    </w:p>
-    <w:p>
-      <w:pPr>
-        <w:keepNext/>
-        <w:keepLines/>
-        <w:pBdr>
-          <w:top w:val="single" w:sz="4" w:space="4" w:color="BFBFBF"/>
-          <w:left w:val="single" w:sz="4" w:space="4" w:color="BFBFBF"/>
-          <w:bottom w:val="single" w:sz="4" w:space="4" w:color="BFBFBF"/>
-          <w:right w:val="single" w:sz="4" w:space="4" w:color="BFBFBF"/>
-        </w:pBdr>
-        <w:shd w:val="clear" w:color="auto" w:fill="F5F5F5"/>
-        <w:spacing w:before="0" w:after="0" w:line="240" w:lineRule="auto"/>
-        <w:ind w:left="113" w:right="113"/>
-        <w:jc w:val="left"/>
-      </w:pPr>
-      <w:r>
-        <w:rPr>
-          <w:rFonts w:ascii="Consolas" w:hAnsi="Consolas" w:cs="Courier New"/>
-          <w:sz w:val="18"/>
-          <w:szCs w:val="18"/>
-          <w:lang w:val="en-GB"/>
-        </w:rPr>
-        <w:t xml:space="preserve">factories.get(RoomType.SINGLE).openRoom(102);</w:t>
-      </w:r>
-    </w:p>
-    <w:p>
-      <w:pPr>
-        <w:keepNext/>
-        <w:keepLines/>
-        <w:pBdr>
-          <w:top w:val="single" w:sz="4" w:space="4" w:color="BFBFBF"/>
-          <w:left w:val="single" w:sz="4" w:space="4" w:color="BFBFBF"/>
-          <w:bottom w:val="single" w:sz="4" w:space="4" w:color="BFBFBF"/>
-          <w:right w:val="single" w:sz="4" w:space="4" w:color="BFBFBF"/>
-        </w:pBdr>
-        <w:shd w:val="clear" w:color="auto" w:fill="F5F5F5"/>
-        <w:spacing w:before="0" w:after="0" w:line="240" w:lineRule="auto"/>
-        <w:ind w:left="113" w:right="113"/>
-        <w:jc w:val="left"/>
-      </w:pPr>
-      <w:r>
-        <w:rPr>
-          <w:rFonts w:ascii="Consolas" w:hAnsi="Consolas" w:cs="Courier New"/>
-          <w:sz w:val="18"/>
-          <w:szCs w:val="18"/>
-          <w:lang w:val="en-GB"/>
-        </w:rPr>
-        <w:t xml:space="preserve">factories.get(RoomType.DOUBLE).openRoom(201);</w:t>
-      </w:r>
-    </w:p>
-    <w:p>
-      <w:pPr>
-        <w:keepNext/>
-        <w:keepLines/>
-        <w:pBdr>
-          <w:top w:val="single" w:sz="4" w:space="4" w:color="BFBFBF"/>
-          <w:left w:val="single" w:sz="4" w:space="4" w:color="BFBFBF"/>
-          <w:bottom w:val="single" w:sz="4" w:space="4" w:color="BFBFBF"/>
-          <w:right w:val="single" w:sz="4" w:space="4" w:color="BFBFBF"/>
-        </w:pBdr>
-        <w:shd w:val="clear" w:color="auto" w:fill="F5F5F5"/>
-        <w:spacing w:before="0" w:after="0" w:line="240" w:lineRule="auto"/>
-        <w:ind w:left="113" w:right="113"/>
-        <w:jc w:val="left"/>
-      </w:pPr>
-      <w:r>
-        <w:rPr>
-          <w:rFonts w:ascii="Consolas" w:hAnsi="Consolas" w:cs="Courier New"/>
-          <w:sz w:val="18"/>
-          <w:szCs w:val="18"/>
-          <w:lang w:val="en-GB"/>
-        </w:rPr>
-        <w:t xml:space="preserve">factories.get(RoomType.DOUBLE).openRoom(202);</w:t>
+        <w:t xml:space="preserve">factories.get(RoomType.SINGLE).openRoom(101, bookingSystem);</w:t>
+      </w:r>
+    </w:p>
+    <w:p>
+      <w:pPr>
+        <w:keepNext/>
+        <w:keepLines/>
+        <w:pBdr>
+          <w:top w:val="single" w:sz="4" w:space="4" w:color="BFBFBF"/>
+          <w:left w:val="single" w:sz="4" w:space="4" w:color="BFBFBF"/>
+          <w:bottom w:val="single" w:sz="4" w:space="4" w:color="BFBFBF"/>
+          <w:right w:val="single" w:sz="4" w:space="4" w:color="BFBFBF"/>
+        </w:pBdr>
+        <w:shd w:val="clear" w:color="auto" w:fill="F5F5F5"/>
+        <w:spacing w:before="0" w:after="0" w:line="240" w:lineRule="auto"/>
+        <w:ind w:left="113" w:right="113"/>
+        <w:jc w:val="left"/>
+      </w:pPr>
+      <w:r>
+        <w:rPr>
+          <w:rFonts w:ascii="Consolas" w:hAnsi="Consolas" w:cs="Courier New"/>
+          <w:sz w:val="18"/>
+          <w:szCs w:val="18"/>
+          <w:lang w:val="en-GB"/>
+        </w:rPr>
+        <w:t xml:space="preserve">factories.get(RoomType.SINGLE).openRoom(102, bookingSystem);</w:t>
+      </w:r>
+    </w:p>
+    <w:p>
+      <w:pPr>
+        <w:keepNext/>
+        <w:keepLines/>
+        <w:pBdr>
+          <w:top w:val="single" w:sz="4" w:space="4" w:color="BFBFBF"/>
+          <w:left w:val="single" w:sz="4" w:space="4" w:color="BFBFBF"/>
+          <w:bottom w:val="single" w:sz="4" w:space="4" w:color="BFBFBF"/>
+          <w:right w:val="single" w:sz="4" w:space="4" w:color="BFBFBF"/>
+        </w:pBdr>
+        <w:shd w:val="clear" w:color="auto" w:fill="F5F5F5"/>
+        <w:spacing w:before="0" w:after="0" w:line="240" w:lineRule="auto"/>
+        <w:ind w:left="113" w:right="113"/>
+        <w:jc w:val="left"/>
+      </w:pPr>
+      <w:r>
+        <w:rPr>
+          <w:rFonts w:ascii="Consolas" w:hAnsi="Consolas" w:cs="Courier New"/>
+          <w:sz w:val="18"/>
+          <w:szCs w:val="18"/>
+          <w:lang w:val="en-GB"/>
+        </w:rPr>
+        <w:t xml:space="preserve">factories.get(RoomType.DOUBLE).openRoom(201, bookingSystem);</w:t>
+      </w:r>
+    </w:p>
+    <w:p>
+      <w:pPr>
+        <w:keepNext/>
+        <w:keepLines/>
+        <w:pBdr>
+          <w:top w:val="single" w:sz="4" w:space="4" w:color="BFBFBF"/>
+          <w:left w:val="single" w:sz="4" w:space="4" w:color="BFBFBF"/>
+          <w:bottom w:val="single" w:sz="4" w:space="4" w:color="BFBFBF"/>
+          <w:right w:val="single" w:sz="4" w:space="4" w:color="BFBFBF"/>
+        </w:pBdr>
+        <w:shd w:val="clear" w:color="auto" w:fill="F5F5F5"/>
+        <w:spacing w:before="0" w:after="0" w:line="240" w:lineRule="auto"/>
+        <w:ind w:left="113" w:right="113"/>
+        <w:jc w:val="left"/>
+      </w:pPr>
+      <w:r>
+        <w:rPr>
+          <w:rFonts w:ascii="Consolas" w:hAnsi="Consolas" w:cs="Courier New"/>
+          <w:sz w:val="18"/>
+          <w:szCs w:val="18"/>
+          <w:lang w:val="en-GB"/>
+        </w:rPr>
+        <w:t xml:space="preserve">factories.get(RoomType.DOUBLE).openRoom(202, bookingSystem);</w:t>
       </w:r>
     </w:p>
     <w:p>
@@ -6002,7 +6519,7 @@
           <w:szCs w:val="18"/>
           <w:lang w:val="en-GB"/>
         </w:rPr>
-        <w:t xml:space="preserve">factories.get(RoomType.SUITE).openRoom(301);</w:t>
+        <w:t xml:space="preserve">factories.get(RoomType.SUITE).openRoom(301, bookingSystem);</w:t>
       </w:r>
     </w:p>
     <w:p>
@@ -6014,7 +6531,7 @@
         <w:rPr>
           <w:lang w:val="en-GB"/>
         </w:rPr>
-        <w:t xml:space="preserve">This also shows how creational patterns work together: the Factory Method registers every new room in the Singleton.</w:t>
+        <w:t xml:space="preserve">The rooms created by the factories are registered in the booking system, and the reservations built later are made for these rooms, so the three patterns work on the same objects.</w:t>
       </w:r>
     </w:p>
     <w:p>
@@ -7407,32 +7924,32 @@
           <w:szCs w:val="18"/>
           <w:lang w:val="en-GB"/>
         </w:rPr>
-        <w:t xml:space="preserve">=== 1. Singleton: BookingSystem ===</w:t>
-      </w:r>
-    </w:p>
-    <w:p>
-      <w:pPr>
-        <w:keepNext/>
-        <w:keepLines/>
-        <w:pBdr>
-          <w:top w:val="single" w:sz="4" w:space="4" w:color="BFBFBF"/>
-          <w:left w:val="single" w:sz="4" w:space="4" w:color="BFBFBF"/>
-          <w:bottom w:val="single" w:sz="4" w:space="4" w:color="BFBFBF"/>
-          <w:right w:val="single" w:sz="4" w:space="4" w:color="BFBFBF"/>
-        </w:pBdr>
-        <w:shd w:val="clear" w:color="auto" w:fill="F5F5F5"/>
-        <w:spacing w:before="0" w:after="0" w:line="240" w:lineRule="auto"/>
-        <w:ind w:left="113" w:right="113"/>
-        <w:jc w:val="left"/>
-      </w:pPr>
-      <w:r>
-        <w:rPr>
-          <w:rFonts w:ascii="Consolas" w:hAnsi="Consolas" w:cs="Courier New"/>
-          <w:sz w:val="18"/>
-          <w:szCs w:val="18"/>
-          <w:lang w:val="en-GB"/>
-        </w:rPr>
-        <w:t xml:space="preserve">[BookingSystem] Single instance created</w:t>
+        <w:t xml:space="preserve">=== 1. Singleton: ReservationNumberGenerator ===</w:t>
+      </w:r>
+    </w:p>
+    <w:p>
+      <w:pPr>
+        <w:keepNext/>
+        <w:keepLines/>
+        <w:pBdr>
+          <w:top w:val="single" w:sz="4" w:space="4" w:color="BFBFBF"/>
+          <w:left w:val="single" w:sz="4" w:space="4" w:color="BFBFBF"/>
+          <w:bottom w:val="single" w:sz="4" w:space="4" w:color="BFBFBF"/>
+          <w:right w:val="single" w:sz="4" w:space="4" w:color="BFBFBF"/>
+        </w:pBdr>
+        <w:shd w:val="clear" w:color="auto" w:fill="F5F5F5"/>
+        <w:spacing w:before="0" w:after="0" w:line="240" w:lineRule="auto"/>
+        <w:ind w:left="113" w:right="113"/>
+        <w:jc w:val="left"/>
+      </w:pPr>
+      <w:r>
+        <w:rPr>
+          <w:rFonts w:ascii="Consolas" w:hAnsi="Consolas" w:cs="Courier New"/>
+          <w:sz w:val="18"/>
+          <w:szCs w:val="18"/>
+          <w:lang w:val="en-GB"/>
+        </w:rPr>
+        <w:t xml:space="preserve">[ReservationNumberGenerator] Single instance created</w:t>
       </w:r>
     </w:p>
     <w:p>
@@ -7732,57 +8249,57 @@
           <w:szCs w:val="18"/>
           <w:lang w:val="en-GB"/>
         </w:rPr>
-        <w:t xml:space="preserve">BOOKED   Maria Popescu | room 201 (DOUBLE) | 2026-11-10 -&gt; 2026-11-13 (3 nights) | 2 guest(s) | extras: breakfast parking | request: Room on a high floor | total: 390 EUR</w:t>
-      </w:r>
-    </w:p>
-    <w:p>
-      <w:pPr>
-        <w:keepNext/>
-        <w:keepLines/>
-        <w:pBdr>
-          <w:top w:val="single" w:sz="4" w:space="4" w:color="BFBFBF"/>
-          <w:left w:val="single" w:sz="4" w:space="4" w:color="BFBFBF"/>
-          <w:bottom w:val="single" w:sz="4" w:space="4" w:color="BFBFBF"/>
-          <w:right w:val="single" w:sz="4" w:space="4" w:color="BFBFBF"/>
-        </w:pBdr>
-        <w:shd w:val="clear" w:color="auto" w:fill="F5F5F5"/>
-        <w:spacing w:before="0" w:after="0" w:line="240" w:lineRule="auto"/>
-        <w:ind w:left="113" w:right="113"/>
-        <w:jc w:val="left"/>
-      </w:pPr>
-      <w:r>
-        <w:rPr>
-          <w:rFonts w:ascii="Consolas" w:hAnsi="Consolas" w:cs="Courier New"/>
-          <w:sz w:val="18"/>
-          <w:szCs w:val="18"/>
-          <w:lang w:val="en-GB"/>
-        </w:rPr>
-        <w:t xml:space="preserve">BOOKED   Ion Rusu | room 301 (SUITE) | 2026-11-13 -&gt; 2026-11-15 (2 nights) | 2 guest(s) | extras: breakfast | request: Late check-out | total: 420 EUR</w:t>
-      </w:r>
-    </w:p>
-    <w:p>
-      <w:pPr>
-        <w:keepNext/>
-        <w:keepLines/>
-        <w:pBdr>
-          <w:top w:val="single" w:sz="4" w:space="4" w:color="BFBFBF"/>
-          <w:left w:val="single" w:sz="4" w:space="4" w:color="BFBFBF"/>
-          <w:bottom w:val="single" w:sz="4" w:space="4" w:color="BFBFBF"/>
-          <w:right w:val="single" w:sz="4" w:space="4" w:color="BFBFBF"/>
-        </w:pBdr>
-        <w:shd w:val="clear" w:color="auto" w:fill="F5F5F5"/>
-        <w:spacing w:before="0" w:after="0" w:line="240" w:lineRule="auto"/>
-        <w:ind w:left="113" w:right="113"/>
-        <w:jc w:val="left"/>
-      </w:pPr>
-      <w:r>
-        <w:rPr>
-          <w:rFonts w:ascii="Consolas" w:hAnsi="Consolas" w:cs="Courier New"/>
-          <w:sz w:val="18"/>
-          <w:szCs w:val="18"/>
-          <w:lang w:val="en-GB"/>
-        </w:rPr>
-        <w:t xml:space="preserve">BOOKED   Elena Ciobanu | room 101 (SINGLE) | 2026-11-10 -&gt; 2026-11-12 (2 nights) | 1 guest(s) | extras: breakfast parking airport-transfer | request: - | total: 200 EUR</w:t>
+        <w:t xml:space="preserve">BOOKED   RES-0001 | Maria Popescu | room 201 (DOUBLE) | 2026-11-10 -&gt; 2026-11-13 (3 nights) | 2 guest(s) | extras: breakfast parking | request: Room on a high floor | total: 390 EUR</w:t>
+      </w:r>
+    </w:p>
+    <w:p>
+      <w:pPr>
+        <w:keepNext/>
+        <w:keepLines/>
+        <w:pBdr>
+          <w:top w:val="single" w:sz="4" w:space="4" w:color="BFBFBF"/>
+          <w:left w:val="single" w:sz="4" w:space="4" w:color="BFBFBF"/>
+          <w:bottom w:val="single" w:sz="4" w:space="4" w:color="BFBFBF"/>
+          <w:right w:val="single" w:sz="4" w:space="4" w:color="BFBFBF"/>
+        </w:pBdr>
+        <w:shd w:val="clear" w:color="auto" w:fill="F5F5F5"/>
+        <w:spacing w:before="0" w:after="0" w:line="240" w:lineRule="auto"/>
+        <w:ind w:left="113" w:right="113"/>
+        <w:jc w:val="left"/>
+      </w:pPr>
+      <w:r>
+        <w:rPr>
+          <w:rFonts w:ascii="Consolas" w:hAnsi="Consolas" w:cs="Courier New"/>
+          <w:sz w:val="18"/>
+          <w:szCs w:val="18"/>
+          <w:lang w:val="en-GB"/>
+        </w:rPr>
+        <w:t xml:space="preserve">BOOKED   RES-0002 | Ion Rusu | room 301 (SUITE) | 2026-11-13 -&gt; 2026-11-15 (2 nights) | 2 guest(s) | extras: breakfast | request: Late check-out | total: 420 EUR</w:t>
+      </w:r>
+    </w:p>
+    <w:p>
+      <w:pPr>
+        <w:keepNext/>
+        <w:keepLines/>
+        <w:pBdr>
+          <w:top w:val="single" w:sz="4" w:space="4" w:color="BFBFBF"/>
+          <w:left w:val="single" w:sz="4" w:space="4" w:color="BFBFBF"/>
+          <w:bottom w:val="single" w:sz="4" w:space="4" w:color="BFBFBF"/>
+          <w:right w:val="single" w:sz="4" w:space="4" w:color="BFBFBF"/>
+        </w:pBdr>
+        <w:shd w:val="clear" w:color="auto" w:fill="F5F5F5"/>
+        <w:spacing w:before="0" w:after="0" w:line="240" w:lineRule="auto"/>
+        <w:ind w:left="113" w:right="113"/>
+        <w:jc w:val="left"/>
+      </w:pPr>
+      <w:r>
+        <w:rPr>
+          <w:rFonts w:ascii="Consolas" w:hAnsi="Consolas" w:cs="Courier New"/>
+          <w:sz w:val="18"/>
+          <w:szCs w:val="18"/>
+          <w:lang w:val="en-GB"/>
+        </w:rPr>
+        <w:t xml:space="preserve">BOOKED   RES-0003 | Elena Ciobanu | room 101 (SINGLE) | 2026-11-10 -&gt; 2026-11-12 (2 nights) | 1 guest(s) | extras: breakfast parking airport-transfer | request: - | total: 200 EUR</w:t>
       </w:r>
     </w:p>
     <w:p>
@@ -7832,7 +8349,7 @@
           <w:szCs w:val="18"/>
           <w:lang w:val="en-GB"/>
         </w:rPr>
-        <w:t xml:space="preserve">REJECTED Victor Moraru | room 301 (SUITE) | 2026-11-14 -&gt; 2026-11-16 (2 nights) | 1 guest(s) | extras: none | request: - | total: 360 EUR</w:t>
+        <w:t xml:space="preserve">REJECTED | Victor Moraru | room 301 (SUITE) | 2026-11-14 -&gt; 2026-11-16 (2 nights) | 1 guest(s) | extras: none | request: - | total: 360 EUR</w:t>
       </w:r>
     </w:p>
     <w:p>
@@ -7894,7 +8411,7 @@
         <w:rPr>
           <w:lang w:val="en-GB"/>
         </w:rPr>
-        <w:t xml:space="preserve"> five threads requested the booking system at the same time, yet the constructor ran only once and all of them received the same object.</w:t>
+        <w:t xml:space="preserve"> five threads requested the number generator at the same time, yet the constructor ran only once and all of them received the same object. The three confirmed reservations received consecutive, unique codes (RES-0001 to RES-0003).</w:t>
       </w:r>
     </w:p>
     <w:p>
@@ -7979,13 +8496,13 @@
           <w:bCs/>
           <w:lang w:val="en-GB"/>
         </w:rPr>
-        <w:t xml:space="preserve">Patterns working together:</w:t>
-      </w:r>
-      <w:r>
-        <w:rPr>
-          <w:lang w:val="en-GB"/>
-        </w:rPr>
-        <w:t xml:space="preserve"> the booking for the suite on 14–16 November was rejected because it overlaps the weekend package. This works only because every part of the program shares the same </w:t>
+        <w:t xml:space="preserve">Booking system:</w:t>
+      </w:r>
+      <w:r>
+        <w:rPr>
+          <w:lang w:val="en-GB"/>
+        </w:rPr>
+        <w:t xml:space="preserve"> the booking for the suite on 14–16 November was rejected because it overlaps the weekend package, and it did not consume a confirmation code. This works because the client created one </w:t>
       </w:r>
       <w:r>
         <w:rPr>
@@ -8001,7 +8518,7 @@
         <w:rPr>
           <w:lang w:val="en-GB"/>
         </w:rPr>
-        <w:t xml:space="preserve"> instance.</w:t>
+        <w:t xml:space="preserve"> and passed the same object to every part of the program, without making it a Singleton.</w:t>
       </w:r>
     </w:p>
     <w:p>
@@ -8057,7 +8574,53 @@
         <w:rPr>
           <w:lang w:val="en-GB"/>
         </w:rPr>
-        <w:t xml:space="preserve"> guarantees that the whole application works with one booking system, which keeps all rooms and reservations in one place and prevents double bookings. Making it thread-safe with double-checked locking was essential, since several reception desks can access it at the same time.</w:t>
+        <w:t xml:space="preserve"> guarantees that the hotel has exactly one reservation number generator, so confirmation codes are never duplicated. Making it thread-safe with double-checked locking and a </w:t>
+      </w:r>
+      <w:r>
+        <w:rPr>
+          <w:rFonts w:ascii="Consolas" w:hAnsi="Consolas" w:cs="Courier New"/>
+          <w:sz w:val="22"/>
+          <w:szCs w:val="22"/>
+          <w:shd w:val="clear" w:color="auto" w:fill="F2F2F2"/>
+          <w:lang w:val="en-GB"/>
+        </w:rPr>
+        <w:t xml:space="preserve">synchronized</w:t>
+      </w:r>
+      <w:r>
+        <w:rPr>
+          <w:lang w:val="en-GB"/>
+        </w:rPr>
+        <w:t xml:space="preserve"> </w:t>
+      </w:r>
+      <w:r>
+        <w:rPr>
+          <w:rFonts w:ascii="Consolas" w:hAnsi="Consolas" w:cs="Courier New"/>
+          <w:sz w:val="22"/>
+          <w:szCs w:val="22"/>
+          <w:shd w:val="clear" w:color="auto" w:fill="F2F2F2"/>
+          <w:lang w:val="en-GB"/>
+        </w:rPr>
+        <w:t xml:space="preserve">next()</w:t>
+      </w:r>
+      <w:r>
+        <w:rPr>
+          <w:lang w:val="en-GB"/>
+        </w:rPr>
+        <w:t xml:space="preserve"> method was essential, since several reception desks can book at the same time. An important lesson was choosing </w:t>
+      </w:r>
+      <w:r>
+        <w:rPr>
+          <w:i/>
+          <w:iCs/>
+          <w:lang w:val="en-GB"/>
+        </w:rPr>
+        <w:t xml:space="preserve">what</w:t>
+      </w:r>
+      <w:r>
+        <w:rPr>
+          <w:lang w:val="en-GB"/>
+        </w:rPr>
+        <w:t xml:space="preserve"> to make a Singleton: the booking system stores data like a database, so it is injected instead, which keeps it replaceable and testable.</w:t>
       </w:r>
     </w:p>
     <w:p>
@@ -8119,7 +8682,7 @@
         <w:rPr>
           <w:lang w:val="en-GB"/>
         </w:rPr>
-        <w:t xml:space="preserve">The patterns also complement each other: the factories register their rooms in the Singleton, and the builder creates reservations for rooms that the factories produced. The remaining patterns — Abstract Factory, Prototype and Object Pool — solve related problems (families of objects, cloning, and reusing expensive objects). They were described in the theoretical part with examples of how they could extend this project.</w:t>
+        <w:t xml:space="preserve">The patterns also complement each other: the factories create the rooms, the builder creates reservations for those rooms, and the Singleton numbers every confirmed booking. The remaining patterns — Abstract Factory, Prototype and Object Pool — solve related problems (families of objects, cloning, and reusing expensive objects). They were described in the theoretical part with examples of how they could extend this project.</w:t>
       </w:r>
     </w:p>
     <w:p>

</xml_diff>

<commit_message>
Lab 1: add architecture, class and sequence diagrams
</commit_message>
<xml_diff>
--- a/lab1/report/Report_Lab1.docx
+++ b/lab1/report/Report_Lab1.docx
@@ -4028,6 +4028,88 @@
     </w:p>
     <w:p>
       <w:pPr>
+        <w:pStyle w:val="NoSpacing"/>
+        <w:spacing w:after="120"/>
+      </w:pPr>
+      <w:r>
+        <w:rPr>
+          <w:lang w:val="en-GB"/>
+        </w:rPr>
+        <w:t xml:space="preserve">Figure 1 shows the architecture of the project: the packages, the classes that belong to each pattern and how they depend on each other. The numbered arrows from </w:t>
+      </w:r>
+      <w:r>
+        <w:rPr>
+          <w:rFonts w:ascii="Consolas" w:hAnsi="Consolas" w:cs="Courier New"/>
+          <w:sz w:val="22"/>
+          <w:szCs w:val="22"/>
+          <w:shd w:val="clear" w:color="auto" w:fill="F2F2F2"/>
+          <w:lang w:val="en-GB"/>
+        </w:rPr>
+        <w:t xml:space="preserve">Main</w:t>
+      </w:r>
+      <w:r>
+        <w:rPr>
+          <w:lang w:val="en-GB"/>
+        </w:rPr>
+        <w:t xml:space="preserve"> follow the order in which the client uses the patterns.</w:t>
+      </w:r>
+    </w:p>
+    <w:p>
+      <w:pPr>
+        <w:keepNext/>
+        <w:spacing w:before="160" w:after="60"/>
+        <w:jc w:val="center"/>
+      </w:pPr>
+      <w:r>
+        <w:drawing>
+          <wp:inline distT="0" distB="0" distL="0" distR="0">
+            <wp:extent cx="6120130" cy="2849295"/>
+            <wp:docPr id="101" name="Diagram 1"/>
+            <a:graphic xmlns:a="http://schemas.openxmlformats.org/drawingml/2006/main">
+              <a:graphicData uri="http://schemas.openxmlformats.org/drawingml/2006/picture">
+                <pic:pic xmlns:pic="http://schemas.openxmlformats.org/drawingml/2006/picture">
+                  <pic:nvPicPr>
+                    <pic:cNvPr id="101" name="diagram1.png"/>
+                    <pic:cNvPicPr/>
+                  </pic:nvPicPr>
+                  <pic:blipFill>
+                    <a:blip r:embed="rIdDiagram1"/>
+                    <a:stretch>
+                      <a:fillRect/>
+                    </a:stretch>
+                  </pic:blipFill>
+                  <pic:spPr>
+                    <a:xfrm>
+                      <a:off x="0" y="0"/>
+                      <a:ext cx="6120130" cy="2849295"/>
+                    </a:xfrm>
+                    <a:prstGeom prst="rect">
+                      <a:avLst/>
+                    </a:prstGeom>
+                  </pic:spPr>
+                </pic:pic>
+              </a:graphicData>
+            </a:graphic>
+          </wp:inline>
+        </w:drawing>
+      </w:r>
+    </w:p>
+    <w:p>
+      <w:pPr>
+        <w:spacing w:after="200"/>
+        <w:jc w:val="center"/>
+      </w:pPr>
+      <w:r>
+        <w:rPr>
+          <w:i/>
+          <w:iCs/>
+          <w:lang w:val="en-GB"/>
+        </w:rPr>
+        <w:t xml:space="preserve">Figure 1. Architecture of the hotel booking system (red: Singleton, blue: Factory Method, green: Builder)</w:t>
+      </w:r>
+    </w:p>
+    <w:p>
+      <w:pPr>
         <w:pStyle w:val="Heading2"/>
         <w:keepNext/>
         <w:keepLines/>
@@ -4049,7 +4131,6 @@
     <w:p>
       <w:pPr>
         <w:pStyle w:val="NoSpacing"/>
-        <w:keepNext/>
         <w:spacing w:after="120"/>
       </w:pPr>
       <w:r>
@@ -4156,6 +4237,60 @@
     <w:p>
       <w:pPr>
         <w:keepNext/>
+        <w:spacing w:before="160" w:after="60"/>
+        <w:jc w:val="center"/>
+      </w:pPr>
+      <w:r>
+        <w:drawing>
+          <wp:inline distT="0" distB="0" distL="0" distR="0">
+            <wp:extent cx="6120130" cy="5097506"/>
+            <wp:docPr id="102" name="Diagram 2"/>
+            <a:graphic xmlns:a="http://schemas.openxmlformats.org/drawingml/2006/main">
+              <a:graphicData uri="http://schemas.openxmlformats.org/drawingml/2006/picture">
+                <pic:pic xmlns:pic="http://schemas.openxmlformats.org/drawingml/2006/picture">
+                  <pic:nvPicPr>
+                    <pic:cNvPr id="102" name="diagram2.png"/>
+                    <pic:cNvPicPr/>
+                  </pic:nvPicPr>
+                  <pic:blipFill>
+                    <a:blip r:embed="rIdDiagram2"/>
+                    <a:stretch>
+                      <a:fillRect/>
+                    </a:stretch>
+                  </pic:blipFill>
+                  <pic:spPr>
+                    <a:xfrm>
+                      <a:off x="0" y="0"/>
+                      <a:ext cx="6120130" cy="5097506"/>
+                    </a:xfrm>
+                    <a:prstGeom prst="rect">
+                      <a:avLst/>
+                    </a:prstGeom>
+                  </pic:spPr>
+                </pic:pic>
+              </a:graphicData>
+            </a:graphic>
+          </wp:inline>
+        </w:drawing>
+      </w:r>
+    </w:p>
+    <w:p>
+      <w:pPr>
+        <w:spacing w:after="200"/>
+        <w:jc w:val="center"/>
+      </w:pPr>
+      <w:r>
+        <w:rPr>
+          <w:i/>
+          <w:iCs/>
+          <w:lang w:val="en-GB"/>
+        </w:rPr>
+        <w:t xml:space="preserve">Figure 2. Singleton: ReservationNumberGenerator holds its only instance in a static field; BookingSystem receives it through the constructor</w:t>
+      </w:r>
+    </w:p>
+    <w:p>
+      <w:pPr>
+        <w:keepNext/>
         <w:keepLines/>
         <w:pBdr>
           <w:top w:val="single" w:sz="4" w:space="4" w:color="BFBFBF"/>
@@ -5635,7 +5770,6 @@
     <w:p>
       <w:pPr>
         <w:pStyle w:val="NoSpacing"/>
-        <w:keepNext/>
         <w:spacing w:after="120"/>
       </w:pPr>
       <w:r>
@@ -5722,6 +5856,60 @@
     <w:p>
       <w:pPr>
         <w:keepNext/>
+        <w:spacing w:before="160" w:after="60"/>
+        <w:jc w:val="center"/>
+      </w:pPr>
+      <w:r>
+        <w:drawing>
+          <wp:inline distT="0" distB="0" distL="0" distR="0">
+            <wp:extent cx="6120130" cy="2880520"/>
+            <wp:docPr id="103" name="Diagram 3"/>
+            <a:graphic xmlns:a="http://schemas.openxmlformats.org/drawingml/2006/main">
+              <a:graphicData uri="http://schemas.openxmlformats.org/drawingml/2006/picture">
+                <pic:pic xmlns:pic="http://schemas.openxmlformats.org/drawingml/2006/picture">
+                  <pic:nvPicPr>
+                    <pic:cNvPr id="103" name="diagram3.png"/>
+                    <pic:cNvPicPr/>
+                  </pic:nvPicPr>
+                  <pic:blipFill>
+                    <a:blip r:embed="rIdDiagram3"/>
+                    <a:stretch>
+                      <a:fillRect/>
+                    </a:stretch>
+                  </pic:blipFill>
+                  <pic:spPr>
+                    <a:xfrm>
+                      <a:off x="0" y="0"/>
+                      <a:ext cx="6120130" cy="2880520"/>
+                    </a:xfrm>
+                    <a:prstGeom prst="rect">
+                      <a:avLst/>
+                    </a:prstGeom>
+                  </pic:spPr>
+                </pic:pic>
+              </a:graphicData>
+            </a:graphic>
+          </wp:inline>
+        </w:drawing>
+      </w:r>
+    </w:p>
+    <w:p>
+      <w:pPr>
+        <w:spacing w:after="200"/>
+        <w:jc w:val="center"/>
+      </w:pPr>
+      <w:r>
+        <w:rPr>
+          <w:i/>
+          <w:iCs/>
+          <w:lang w:val="en-GB"/>
+        </w:rPr>
+        <w:t xml:space="preserve">Figure 3. Factory Method: each concrete creator overrides createRoom() and creates its own concrete product</w:t>
+      </w:r>
+    </w:p>
+    <w:p>
+      <w:pPr>
+        <w:keepNext/>
         <w:keepLines/>
         <w:pBdr>
           <w:top w:val="single" w:sz="4" w:space="4" w:color="BFBFBF"/>
@@ -6557,7 +6745,6 @@
     <w:p>
       <w:pPr>
         <w:pStyle w:val="NoSpacing"/>
-        <w:keepNext/>
         <w:spacing w:after="120"/>
       </w:pPr>
       <w:r>
@@ -6632,6 +6819,60 @@
     <w:p>
       <w:pPr>
         <w:keepNext/>
+        <w:spacing w:before="160" w:after="60"/>
+        <w:jc w:val="center"/>
+      </w:pPr>
+      <w:r>
+        <w:drawing>
+          <wp:inline distT="0" distB="0" distL="0" distR="0">
+            <wp:extent cx="6120130" cy="6674376"/>
+            <wp:docPr id="104" name="Diagram 4"/>
+            <a:graphic xmlns:a="http://schemas.openxmlformats.org/drawingml/2006/main">
+              <a:graphicData uri="http://schemas.openxmlformats.org/drawingml/2006/picture">
+                <pic:pic xmlns:pic="http://schemas.openxmlformats.org/drawingml/2006/picture">
+                  <pic:nvPicPr>
+                    <pic:cNvPr id="104" name="diagram4.png"/>
+                    <pic:cNvPicPr/>
+                  </pic:nvPicPr>
+                  <pic:blipFill>
+                    <a:blip r:embed="rIdDiagram4"/>
+                    <a:stretch>
+                      <a:fillRect/>
+                    </a:stretch>
+                  </pic:blipFill>
+                  <pic:spPr>
+                    <a:xfrm>
+                      <a:off x="0" y="0"/>
+                      <a:ext cx="6120130" cy="6674376"/>
+                    </a:xfrm>
+                    <a:prstGeom prst="rect">
+                      <a:avLst/>
+                    </a:prstGeom>
+                  </pic:spPr>
+                </pic:pic>
+              </a:graphicData>
+            </a:graphic>
+          </wp:inline>
+        </w:drawing>
+      </w:r>
+    </w:p>
+    <w:p>
+      <w:pPr>
+        <w:spacing w:after="200"/>
+        <w:jc w:val="center"/>
+      </w:pPr>
+      <w:r>
+        <w:rPr>
+          <w:i/>
+          <w:iCs/>
+          <w:lang w:val="en-GB"/>
+        </w:rPr>
+        <w:t xml:space="preserve">Figure 4. Builder: the client builds custom reservations directly or uses the Director's preset recipes; only build() can create a Reservation</w:t>
+      </w:r>
+    </w:p>
+    <w:p>
+      <w:pPr>
+        <w:keepNext/>
         <w:keepLines/>
         <w:pBdr>
           <w:top w:val="single" w:sz="4" w:space="4" w:color="BFBFBF"/>
@@ -7853,6 +8094,108 @@
           <w:lang w:val="en-GB"/>
         </w:rPr>
         <w:t xml:space="preserve">}</w:t>
+      </w:r>
+    </w:p>
+    <w:p>
+      <w:pPr>
+        <w:pStyle w:val="Heading2"/>
+        <w:keepNext/>
+        <w:keepLines/>
+        <w:spacing w:before="240" w:after="120"/>
+      </w:pPr>
+      <w:r>
+        <w:rPr>
+          <w:rFonts w:ascii="Times New Roman" w:hAnsi="Times New Roman" w:cs="Times New Roman"/>
+          <w:b/>
+          <w:bCs/>
+          <w:color w:val="000000"/>
+          <w:sz w:val="24"/>
+          <w:szCs w:val="24"/>
+          <w:lang w:val="en-GB"/>
+        </w:rPr>
+        <w:t xml:space="preserve">4.5 Runtime Flow</w:t>
+      </w:r>
+    </w:p>
+    <w:p>
+      <w:pPr>
+        <w:pStyle w:val="NoSpacing"/>
+        <w:spacing w:after="120"/>
+      </w:pPr>
+      <w:r>
+        <w:rPr>
+          <w:lang w:val="en-GB"/>
+        </w:rPr>
+        <w:t xml:space="preserve">The sequence diagram in Figure 5 shows how the three patterns cooperate when the first reservation is made. The client gets the single number generator and creates the booking system with it (Singleton). It opens room 201 through a factory, which decides the concrete room class (Factory Method). It then builds and validates Maria's reservation step by step (Builder). Finally, the booking system checks that the room is free and asks the generator for the confirmation code </w:t>
+      </w:r>
+      <w:r>
+        <w:rPr>
+          <w:rFonts w:ascii="Consolas" w:hAnsi="Consolas" w:cs="Courier New"/>
+          <w:sz w:val="22"/>
+          <w:szCs w:val="22"/>
+          <w:shd w:val="clear" w:color="auto" w:fill="F2F2F2"/>
+          <w:lang w:val="en-GB"/>
+        </w:rPr>
+        <w:t xml:space="preserve">RES-0001</w:t>
+      </w:r>
+      <w:r>
+        <w:rPr>
+          <w:lang w:val="en-GB"/>
+        </w:rPr>
+        <w:t xml:space="preserve">.</w:t>
+      </w:r>
+    </w:p>
+    <w:p>
+      <w:pPr>
+        <w:keepNext/>
+        <w:spacing w:before="160" w:after="60"/>
+        <w:jc w:val="center"/>
+      </w:pPr>
+      <w:r>
+        <w:drawing>
+          <wp:inline distT="0" distB="0" distL="0" distR="0">
+            <wp:extent cx="6120130" cy="5729815"/>
+            <wp:docPr id="105" name="Diagram 5"/>
+            <a:graphic xmlns:a="http://schemas.openxmlformats.org/drawingml/2006/main">
+              <a:graphicData uri="http://schemas.openxmlformats.org/drawingml/2006/picture">
+                <pic:pic xmlns:pic="http://schemas.openxmlformats.org/drawingml/2006/picture">
+                  <pic:nvPicPr>
+                    <pic:cNvPr id="105" name="diagram5.png"/>
+                    <pic:cNvPicPr/>
+                  </pic:nvPicPr>
+                  <pic:blipFill>
+                    <a:blip r:embed="rIdDiagram5"/>
+                    <a:stretch>
+                      <a:fillRect/>
+                    </a:stretch>
+                  </pic:blipFill>
+                  <pic:spPr>
+                    <a:xfrm>
+                      <a:off x="0" y="0"/>
+                      <a:ext cx="6120130" cy="5729815"/>
+                    </a:xfrm>
+                    <a:prstGeom prst="rect">
+                      <a:avLst/>
+                    </a:prstGeom>
+                  </pic:spPr>
+                </pic:pic>
+              </a:graphicData>
+            </a:graphic>
+          </wp:inline>
+        </w:drawing>
+      </w:r>
+    </w:p>
+    <w:p>
+      <w:pPr>
+        <w:spacing w:after="200"/>
+        <w:jc w:val="center"/>
+      </w:pPr>
+      <w:r>
+        <w:rPr>
+          <w:i/>
+          <w:iCs/>
+          <w:lang w:val="en-GB"/>
+        </w:rPr>
+        <w:t xml:space="preserve">Figure 5. Sequence diagram: how Singleton, Factory Method and Builder work together to create and book the first reservation</w:t>
       </w:r>
     </w:p>
     <w:p>

</xml_diff>